<commit_message>
Add a Persistence row to the TDS component and dependency tables
Neither section 3.1's component responsibility matrix nor section
11.2's dependency direction table had a row for Persistence, even
though it's a real module with real behavior. Added both, matching
what persistence.py actually does. Also cross-references a second
consequence of the runner.py stdout/stderr issue in KNOWN_ISSUES.md:
persistence.py can't preserve trial-local stdout/stderr (per section
10.4) until runner.py actually returns what it captures.
</commit_message>
<xml_diff>
--- a/docs/planning_baseline_v02/Black_Box_Optimizer_Technical_Design_Specification.docx
+++ b/docs/planning_baseline_v02/Black_Box_Optimizer_Technical_Design_Specification.docx
@@ -69,13 +69,6 @@
           <w:sz w:val="17"/>
         </w:rPr>
         <w:t>DESIGN AUTHORITY</w:t>
-      </w:r>
-      <w:r>
-        <w:rPr>
-          <w:b/>
-          <w:color w:val="2E74B5"/>
-          <w:sz w:val="17"/>
-        </w:rPr>
         <w:br/>
       </w:r>
       <w:r>
@@ -554,10 +547,7 @@
         <w:pStyle w:val="Heading2"/>
       </w:pPr>
       <w:r>
-        <w:t>D</w:t>
-      </w:r>
-      <w:r>
-        <w:t>esign at a Glance</w:t>
+        <w:t>Design at a Glance</w:t>
       </w:r>
     </w:p>
     <w:tbl>
@@ -1584,13 +1574,6 @@
           <w:sz w:val="17"/>
         </w:rPr>
         <w:t>CONTROLLED VOCABULARY</w:t>
-      </w:r>
-      <w:r>
-        <w:rPr>
-          <w:b/>
-          <w:color w:val="2E74B5"/>
-          <w:sz w:val="17"/>
-        </w:rPr>
         <w:br/>
       </w:r>
       <w:r>
@@ -2068,19 +2051,7 @@
               <w:rPr>
                 <w:sz w:val="16"/>
               </w:rPr>
-              <w:t xml:space="preserve">Immutable declaration of </w:t>
-            </w:r>
-            <w:r>
-              <w:rPr>
-                <w:sz w:val="16"/>
-              </w:rPr>
-              <w:t>parameter name, kind, and legal domain. MVP kinds</w:t>
-            </w:r>
-            <w:r>
-              <w:rPr>
-                <w:sz w:val="16"/>
-              </w:rPr>
-              <w:t xml:space="preserve"> are integer, float, and categorical.</w:t>
+              <w:t xml:space="preserve">Immutable declaration of parameter name, kind, and legal domain. MVP kinds are integer, float, and categorical.</w:t>
             </w:r>
           </w:p>
         </w:tc>
@@ -2224,13 +2195,7 @@
               <w:rPr>
                 <w:sz w:val="16"/>
               </w:rPr>
-              <w:t>Modular search interface that proposes the next candidate</w:t>
-            </w:r>
-            <w:r>
-              <w:rPr>
-                <w:sz w:val="16"/>
-              </w:rPr>
-              <w:t xml:space="preserve"> from OptimizationContract and read-only TrialHistory.</w:t>
+              <w:t xml:space="preserve">Modular search interface that proposes the next candidate from OptimizationContract and read-only TrialHistory.</w:t>
             </w:r>
           </w:p>
         </w:tc>
@@ -4137,6 +4102,59 @@
           </w:p>
         </w:tc>
       </w:tr>
+      <w:tr>
+        <w:tc>
+          <w:tcPr>
+            <w:tcW w:w="2200" w:type="dxa"/>
+            <w:vAlign w:val="center"/>
+          </w:tcPr>
+          <w:p>
+            <w:pPr>
+              <w:spacing w:after="0" w:line="247" w:lineRule="auto"/>
+            </w:pPr>
+            <w:r>
+              <w:rPr>
+                <w:sz w:val="16"/>
+              </w:rPr>
+              <w:t>Persistence</w:t>
+            </w:r>
+          </w:p>
+        </w:tc>
+        <w:tc>
+          <w:tcPr>
+            <w:tcW w:w="3600" w:type="dxa"/>
+            <w:vAlign w:val="center"/>
+          </w:tcPr>
+          <w:p>
+            <w:pPr>
+              <w:spacing w:after="0" w:line="247" w:lineRule="auto"/>
+            </w:pPr>
+            <w:r>
+              <w:rPr>
+                <w:sz w:val="16"/>
+              </w:rPr>
+              <w:t>Create the run/per-trial directory structure and checkpoint history.csv atomically.</w:t>
+            </w:r>
+          </w:p>
+        </w:tc>
+        <w:tc>
+          <w:tcPr>
+            <w:tcW w:w="3560" w:type="dxa"/>
+            <w:vAlign w:val="center"/>
+          </w:tcPr>
+          <w:p>
+            <w:pPr>
+              <w:spacing w:after="0" w:line="247" w:lineRule="auto"/>
+            </w:pPr>
+            <w:r>
+              <w:rPr>
+                <w:sz w:val="16"/>
+              </w:rPr>
+              <w:t>Rank, evaluate, or interpret metrics; decide termination; select candidates.</w:t>
+            </w:r>
+          </w:p>
+        </w:tc>
+      </w:tr>
     </w:tbl>
     <w:p>
       <w:pPr>
@@ -4160,13 +4178,7 @@
         <w:spacing w:after="60"/>
       </w:pPr>
       <w:r>
-        <w:t xml:space="preserve">Application Controller depends on interfaces, not concrete RandomSearch or </w:t>
-      </w:r>
-      <w:r>
-        <w:t>example-worker internals</w:t>
-      </w:r>
-      <w:r>
-        <w:t>.</w:t>
+        <w:t xml:space="preserve">Application Controller depends on interfaces, not concrete RandomSearch or example-worker internals.</w:t>
       </w:r>
     </w:p>
     <w:p>
@@ -4412,176 +4424,44 @@
           <w:sz w:val="15"/>
         </w:rPr>
         <w:t>ParameterValue = int | float | str</w:t>
-      </w:r>
-      <w:r>
-        <w:rPr>
-          <w:rFonts w:ascii="Consolas" w:hAnsi="Consolas"/>
-          <w:sz w:val="15"/>
-        </w:rPr>
-        <w:br/>
-      </w:r>
-      <w:r>
-        <w:rPr>
-          <w:rFonts w:ascii="Consolas" w:hAnsi="Consolas"/>
-          <w:sz w:val="15"/>
-        </w:rPr>
+        <w:br/>
         <w:br/>
         <w:t>class ParameterKind(StrEnum):</w:t>
-      </w:r>
-      <w:r>
-        <w:rPr>
-          <w:rFonts w:ascii="Consolas" w:hAnsi="Consolas"/>
-          <w:sz w:val="15"/>
-        </w:rPr>
         <w:br/>
         <w:t xml:space="preserve">    INTEGER = "integer"</w:t>
-      </w:r>
-      <w:r>
-        <w:rPr>
-          <w:rFonts w:ascii="Consolas" w:hAnsi="Consolas"/>
-          <w:sz w:val="15"/>
-        </w:rPr>
         <w:br/>
         <w:t xml:space="preserve">    FLOAT = "float"</w:t>
-      </w:r>
-      <w:r>
-        <w:rPr>
-          <w:rFonts w:ascii="Consolas" w:hAnsi="Consolas"/>
-          <w:sz w:val="15"/>
-        </w:rPr>
         <w:br/>
         <w:t xml:space="preserve">    CATEGORICAL = "categorical"</w:t>
-      </w:r>
-      <w:r>
-        <w:rPr>
-          <w:rFonts w:ascii="Consolas" w:hAnsi="Consolas"/>
-          <w:sz w:val="15"/>
-        </w:rPr>
-        <w:br/>
-      </w:r>
-      <w:r>
-        <w:rPr>
-          <w:rFonts w:ascii="Consolas" w:hAnsi="Consolas"/>
-          <w:sz w:val="15"/>
-        </w:rPr>
+        <w:br/>
         <w:br/>
         <w:t>class Direction(StrEnum):</w:t>
-      </w:r>
-      <w:r>
-        <w:rPr>
-          <w:rFonts w:ascii="Consolas" w:hAnsi="Consolas"/>
-          <w:sz w:val="15"/>
-        </w:rPr>
         <w:br/>
         <w:t xml:space="preserve">    MINIMIZE = "minimize"</w:t>
-      </w:r>
-      <w:r>
-        <w:rPr>
-          <w:rFonts w:ascii="Consolas" w:hAnsi="Consolas"/>
-          <w:sz w:val="15"/>
-        </w:rPr>
         <w:br/>
         <w:t xml:space="preserve">    MAXIMIZE = "maximize"</w:t>
-      </w:r>
-      <w:r>
-        <w:rPr>
-          <w:rFonts w:ascii="Consolas" w:hAnsi="Consolas"/>
-          <w:sz w:val="15"/>
-        </w:rPr>
-        <w:br/>
-      </w:r>
-      <w:r>
-        <w:rPr>
-          <w:rFonts w:ascii="Consolas" w:hAnsi="Consolas"/>
-          <w:sz w:val="15"/>
-        </w:rPr>
+        <w:br/>
         <w:br/>
         <w:t>@dataclass(frozen=True, slots=True)</w:t>
-      </w:r>
-      <w:r>
-        <w:rPr>
-          <w:rFonts w:ascii="Consolas" w:hAnsi="Consolas"/>
-          <w:sz w:val="15"/>
-        </w:rPr>
         <w:br/>
         <w:t>class ParameterDefinition:</w:t>
-      </w:r>
-      <w:r>
-        <w:rPr>
-          <w:rFonts w:ascii="Consolas" w:hAnsi="Consolas"/>
-          <w:sz w:val="15"/>
-        </w:rPr>
         <w:br/>
         <w:t xml:space="preserve">    name: str</w:t>
-      </w:r>
-      <w:r>
-        <w:rPr>
-          <w:rFonts w:ascii="Consolas" w:hAnsi="Consolas"/>
-          <w:sz w:val="15"/>
-        </w:rPr>
         <w:br/>
         <w:t xml:space="preserve">    kind: ParameterKind</w:t>
-      </w:r>
-      <w:r>
-        <w:rPr>
-          <w:rFonts w:ascii="Consolas" w:hAnsi="Consolas"/>
-          <w:sz w:val="15"/>
-        </w:rPr>
         <w:br/>
         <w:t xml:space="preserve">    minimum: int | float | None = None</w:t>
-      </w:r>
-      <w:r>
-        <w:rPr>
-          <w:rFonts w:ascii="Consolas" w:hAnsi="Consolas"/>
-          <w:sz w:val="15"/>
-        </w:rPr>
         <w:br/>
         <w:t xml:space="preserve">    maximum: int | float | None = None</w:t>
-      </w:r>
-      <w:r>
-        <w:rPr>
-          <w:rFonts w:ascii="Consolas" w:hAnsi="Consolas"/>
-          <w:sz w:val="15"/>
-        </w:rPr>
         <w:br/>
         <w:t xml:space="preserve">    choices: tuple[ParameterValue, ...] = ()</w:t>
-      </w:r>
-      <w:r>
-        <w:rPr>
-          <w:rFonts w:ascii="Consolas" w:hAnsi="Consolas"/>
-          <w:sz w:val="15"/>
-        </w:rPr>
-        <w:br/>
-      </w:r>
-      <w:r>
-        <w:rPr>
-          <w:rFonts w:ascii="Consolas" w:hAnsi="Consolas"/>
-          <w:sz w:val="15"/>
-        </w:rPr>
+        <w:br/>
         <w:br/>
         <w:t>@dataclass(frozen=True, slots=True)</w:t>
-      </w:r>
-      <w:r>
-        <w:rPr>
-          <w:rFonts w:ascii="Consolas" w:hAnsi="Consolas"/>
-          <w:sz w:val="15"/>
-        </w:rPr>
         <w:br/>
         <w:t>class Objective:</w:t>
-      </w:r>
-      <w:r>
-        <w:rPr>
-          <w:rFonts w:ascii="Consolas" w:hAnsi="Consolas"/>
-          <w:sz w:val="15"/>
-        </w:rPr>
         <w:br/>
         <w:t xml:space="preserve">    metric_name: str</w:t>
-      </w:r>
-      <w:r>
-        <w:rPr>
-          <w:rFonts w:ascii="Consolas" w:hAnsi="Consolas"/>
-          <w:sz w:val="15"/>
-        </w:rPr>
         <w:br/>
         <w:t xml:space="preserve">    direction: Direction</w:t>
       </w:r>
@@ -4889,19 +4769,7 @@
               <w:rPr>
                 <w:sz w:val="16"/>
               </w:rPr>
-              <w:t xml:space="preserve">Larger </w:t>
-            </w:r>
-            <w:r>
-              <w:rPr>
-                <w:sz w:val="16"/>
-              </w:rPr>
-              <w:t>validation_accuracy</w:t>
-            </w:r>
-            <w:r>
-              <w:rPr>
-                <w:sz w:val="16"/>
-              </w:rPr>
-              <w:t xml:space="preserve"> is better</w:t>
+              <w:t xml:space="preserve">Larger validation_accuracy is better</w:t>
             </w:r>
           </w:p>
         </w:tc>
@@ -4989,34 +4857,10 @@
           <w:sz w:val="15"/>
         </w:rPr>
         <w:t>@dataclass(frozen=True)</w:t>
-      </w:r>
-      <w:r>
-        <w:rPr>
-          <w:rFonts w:ascii="Consolas" w:hAnsi="Consolas"/>
-          <w:sz w:val="15"/>
-        </w:rPr>
         <w:br/>
         <w:t>class OptimizationContract:</w:t>
-      </w:r>
-      <w:r>
-        <w:rPr>
-          <w:rFonts w:ascii="Consolas" w:hAnsi="Consolas"/>
-          <w:sz w:val="15"/>
-        </w:rPr>
-        <w:br/>
-      </w:r>
-      <w:r>
-        <w:rPr>
-          <w:rFonts w:ascii="Consolas" w:hAnsi="Consolas"/>
-          <w:sz w:val="15"/>
-        </w:rPr>
+        <w:br/>
         <w:t xml:space="preserve">    parameters: tuple[ParameterDefinition, ...]</w:t>
-      </w:r>
-      <w:r>
-        <w:rPr>
-          <w:rFonts w:ascii="Consolas" w:hAnsi="Consolas"/>
-          <w:sz w:val="15"/>
-        </w:rPr>
         <w:br/>
         <w:t xml:space="preserve">    objectives: tuple[Objective, ...]</w:t>
       </w:r>
@@ -5059,180 +4903,48 @@
           <w:sz w:val="15"/>
         </w:rPr>
         <w:t>OptimizationContract(</w:t>
-      </w:r>
-      <w:r>
-        <w:rPr>
-          <w:rFonts w:ascii="Consolas" w:hAnsi="Consolas"/>
-          <w:sz w:val="15"/>
-        </w:rPr>
         <w:br/>
         <w:t xml:space="preserve">    parameters=(</w:t>
-      </w:r>
-      <w:r>
-        <w:rPr>
-          <w:rFonts w:ascii="Consolas" w:hAnsi="Consolas"/>
-          <w:sz w:val="15"/>
-        </w:rPr>
         <w:br/>
         <w:t xml:space="preserve">        ParameterDefinition(</w:t>
-      </w:r>
-      <w:r>
-        <w:rPr>
-          <w:rFonts w:ascii="Consolas" w:hAnsi="Consolas"/>
-          <w:sz w:val="15"/>
-        </w:rPr>
         <w:br/>
         <w:t xml:space="preserve">            "learning_rate", ParameterKind.FLOAT, 0.0001, 0.1</w:t>
-      </w:r>
-      <w:r>
-        <w:rPr>
-          <w:rFonts w:ascii="Consolas" w:hAnsi="Consolas"/>
-          <w:sz w:val="15"/>
-        </w:rPr>
         <w:br/>
         <w:t xml:space="preserve">        ),</w:t>
-      </w:r>
-      <w:r>
-        <w:rPr>
-          <w:rFonts w:ascii="Consolas" w:hAnsi="Consolas"/>
-          <w:sz w:val="15"/>
-        </w:rPr>
         <w:br/>
         <w:t xml:space="preserve">        ParameterDefinition(</w:t>
-      </w:r>
-      <w:r>
-        <w:rPr>
-          <w:rFonts w:ascii="Consolas" w:hAnsi="Consolas"/>
-          <w:sz w:val="15"/>
-        </w:rPr>
         <w:br/>
         <w:t xml:space="preserve">            "hidden_size", ParameterKind.INTEGER, 4, 128</w:t>
-      </w:r>
-      <w:r>
-        <w:rPr>
-          <w:rFonts w:ascii="Consolas" w:hAnsi="Consolas"/>
-          <w:sz w:val="15"/>
-        </w:rPr>
         <w:br/>
         <w:t xml:space="preserve">        ),</w:t>
-      </w:r>
-      <w:r>
-        <w:rPr>
-          <w:rFonts w:ascii="Consolas" w:hAnsi="Consolas"/>
-          <w:sz w:val="15"/>
-        </w:rPr>
         <w:br/>
         <w:t xml:space="preserve">        ParameterDefinition(</w:t>
-      </w:r>
-      <w:r>
-        <w:rPr>
-          <w:rFonts w:ascii="Consolas" w:hAnsi="Consolas"/>
-          <w:sz w:val="15"/>
-        </w:rPr>
         <w:br/>
         <w:t xml:space="preserve">            "epochs", ParameterKind.INTEGER, 5, 100</w:t>
-      </w:r>
-      <w:r>
-        <w:rPr>
-          <w:rFonts w:ascii="Consolas" w:hAnsi="Consolas"/>
-          <w:sz w:val="15"/>
-        </w:rPr>
         <w:br/>
         <w:t xml:space="preserve">        ),</w:t>
-      </w:r>
-      <w:r>
-        <w:rPr>
-          <w:rFonts w:ascii="Consolas" w:hAnsi="Consolas"/>
-          <w:sz w:val="15"/>
-        </w:rPr>
         <w:br/>
         <w:t xml:space="preserve">        ParameterDefinition(</w:t>
-      </w:r>
-      <w:r>
-        <w:rPr>
-          <w:rFonts w:ascii="Consolas" w:hAnsi="Consolas"/>
-          <w:sz w:val="15"/>
-        </w:rPr>
         <w:br/>
         <w:t xml:space="preserve">            "batch_size",</w:t>
-      </w:r>
-      <w:r>
-        <w:rPr>
-          <w:rFonts w:ascii="Consolas" w:hAnsi="Consolas"/>
-          <w:sz w:val="15"/>
-        </w:rPr>
         <w:br/>
         <w:t xml:space="preserve">            ParameterKind.CATEGORICAL,</w:t>
-      </w:r>
-      <w:r>
-        <w:rPr>
-          <w:rFonts w:ascii="Consolas" w:hAnsi="Consolas"/>
-          <w:sz w:val="15"/>
-        </w:rPr>
         <w:br/>
         <w:t xml:space="preserve">            choices=(8, 16, 32),</w:t>
-      </w:r>
-      <w:r>
-        <w:rPr>
-          <w:rFonts w:ascii="Consolas" w:hAnsi="Consolas"/>
-          <w:sz w:val="15"/>
-        </w:rPr>
         <w:br/>
         <w:t xml:space="preserve">        ),</w:t>
-      </w:r>
-      <w:r>
-        <w:rPr>
-          <w:rFonts w:ascii="Consolas" w:hAnsi="Consolas"/>
-          <w:sz w:val="15"/>
-        </w:rPr>
         <w:br/>
         <w:t xml:space="preserve">    ),</w:t>
-      </w:r>
-      <w:r>
-        <w:rPr>
-          <w:rFonts w:ascii="Consolas" w:hAnsi="Consolas"/>
-          <w:sz w:val="15"/>
-        </w:rPr>
         <w:br/>
         <w:t xml:space="preserve">    objectives=(</w:t>
-      </w:r>
-      <w:r>
-        <w:rPr>
-          <w:rFonts w:ascii="Consolas" w:hAnsi="Consolas"/>
-          <w:sz w:val="15"/>
-        </w:rPr>
         <w:br/>
         <w:t xml:space="preserve">        Objective("validation_accuracy", Direction.MAXIMIZE),</w:t>
-      </w:r>
-      <w:r>
-        <w:rPr>
-          <w:rFonts w:ascii="Consolas" w:hAnsi="Consolas"/>
-          <w:sz w:val="15"/>
-        </w:rPr>
         <w:br/>
         <w:t xml:space="preserve">        Objective("validation_loss", Direction.MINIMIZE),</w:t>
-      </w:r>
-      <w:r>
-        <w:rPr>
-          <w:rFonts w:ascii="Consolas" w:hAnsi="Consolas"/>
-          <w:sz w:val="15"/>
-        </w:rPr>
         <w:br/>
         <w:t xml:space="preserve">        Objective("training_time_seconds", Direction.MINIMIZE),</w:t>
-      </w:r>
-      <w:r>
-        <w:rPr>
-          <w:rFonts w:ascii="Consolas" w:hAnsi="Consolas"/>
-          <w:sz w:val="15"/>
-        </w:rPr>
         <w:br/>
         <w:t xml:space="preserve">    ),</w:t>
-      </w:r>
-      <w:r>
-        <w:rPr>
-          <w:rFonts w:ascii="Consolas" w:hAnsi="Consolas"/>
-          <w:sz w:val="15"/>
-        </w:rPr>
         <w:br/>
         <w:t>)</w:t>
       </w:r>
@@ -5261,67 +4973,19 @@
           <w:sz w:val="15"/>
         </w:rPr>
         <w:t>@dataclass(frozen=True, slots=True)</w:t>
-      </w:r>
-      <w:r>
-        <w:rPr>
-          <w:rFonts w:ascii="Consolas" w:hAnsi="Consolas"/>
-          <w:sz w:val="15"/>
-        </w:rPr>
         <w:br/>
         <w:t>class AlgorithmSpec:</w:t>
-      </w:r>
-      <w:r>
-        <w:rPr>
-          <w:rFonts w:ascii="Consolas" w:hAnsi="Consolas"/>
-          <w:sz w:val="15"/>
-        </w:rPr>
         <w:br/>
         <w:t xml:space="preserve">    name: str</w:t>
-      </w:r>
-      <w:r>
-        <w:rPr>
-          <w:rFonts w:ascii="Consolas" w:hAnsi="Consolas"/>
-          <w:sz w:val="15"/>
-        </w:rPr>
         <w:br/>
         <w:t xml:space="preserve">    seed: int</w:t>
-      </w:r>
-      <w:r>
-        <w:rPr>
-          <w:rFonts w:ascii="Consolas" w:hAnsi="Consolas"/>
-          <w:sz w:val="15"/>
-        </w:rPr>
-        <w:br/>
-      </w:r>
-      <w:r>
-        <w:rPr>
-          <w:rFonts w:ascii="Consolas" w:hAnsi="Consolas"/>
-          <w:sz w:val="15"/>
-        </w:rPr>
+        <w:br/>
         <w:br/>
         <w:t>AlgorithmSpec(</w:t>
-      </w:r>
-      <w:r>
-        <w:rPr>
-          <w:rFonts w:ascii="Consolas" w:hAnsi="Consolas"/>
-          <w:sz w:val="15"/>
-        </w:rPr>
         <w:br/>
         <w:t xml:space="preserve">    name="random_search",</w:t>
-      </w:r>
-      <w:r>
-        <w:rPr>
-          <w:rFonts w:ascii="Consolas" w:hAnsi="Consolas"/>
-          <w:sz w:val="15"/>
-        </w:rPr>
         <w:br/>
         <w:t xml:space="preserve">    seed=42,</w:t>
-      </w:r>
-      <w:r>
-        <w:rPr>
-          <w:rFonts w:ascii="Consolas" w:hAnsi="Consolas"/>
-          <w:sz w:val="15"/>
-        </w:rPr>
         <w:br/>
         <w:t>)</w:t>
       </w:r>
@@ -5343,13 +5007,6 @@
           <w:sz w:val="17"/>
         </w:rPr>
         <w:t>IMMUTABILITY REQUIREMENT</w:t>
-      </w:r>
-      <w:r>
-        <w:rPr>
-          <w:b/>
-          <w:color w:val="8A6500"/>
-          <w:sz w:val="17"/>
-        </w:rPr>
         <w:br/>
       </w:r>
       <w:r>
@@ -5383,146 +5040,38 @@
           <w:sz w:val="15"/>
         </w:rPr>
         <w:t>@dataclass(frozen=True, slots=True)</w:t>
-      </w:r>
-      <w:r>
-        <w:rPr>
-          <w:rFonts w:ascii="Consolas" w:hAnsi="Consolas"/>
-          <w:sz w:val="15"/>
-        </w:rPr>
         <w:br/>
         <w:t>class StopPolicy:</w:t>
-      </w:r>
-      <w:r>
-        <w:rPr>
-          <w:rFonts w:ascii="Consolas" w:hAnsi="Consolas"/>
-          <w:sz w:val="15"/>
-        </w:rPr>
         <w:br/>
         <w:t xml:space="preserve">    max_trials: int</w:t>
-      </w:r>
-      <w:r>
-        <w:rPr>
-          <w:rFonts w:ascii="Consolas" w:hAnsi="Consolas"/>
-          <w:sz w:val="15"/>
-        </w:rPr>
-        <w:br/>
-      </w:r>
-      <w:r>
-        <w:rPr>
-          <w:rFonts w:ascii="Consolas" w:hAnsi="Consolas"/>
-          <w:sz w:val="15"/>
-        </w:rPr>
+        <w:br/>
         <w:br/>
         <w:t>@dataclass(frozen=True, slots=True)</w:t>
-      </w:r>
-      <w:r>
-        <w:rPr>
-          <w:rFonts w:ascii="Consolas" w:hAnsi="Consolas"/>
-          <w:sz w:val="15"/>
-        </w:rPr>
         <w:br/>
         <w:t>class WorkerSpec:</w:t>
-      </w:r>
-      <w:r>
-        <w:rPr>
-          <w:rFonts w:ascii="Consolas" w:hAnsi="Consolas"/>
-          <w:sz w:val="15"/>
-        </w:rPr>
         <w:br/>
         <w:t xml:space="preserve">    command: tuple[str, ...]</w:t>
-      </w:r>
-      <w:r>
-        <w:rPr>
-          <w:rFonts w:ascii="Consolas" w:hAnsi="Consolas"/>
-          <w:sz w:val="15"/>
-        </w:rPr>
         <w:br/>
         <w:t xml:space="preserve">    metrics_argument: str</w:t>
-      </w:r>
-      <w:r>
-        <w:rPr>
-          <w:rFonts w:ascii="Consolas" w:hAnsi="Consolas"/>
-          <w:sz w:val="15"/>
-        </w:rPr>
         <w:br/>
         <w:t xml:space="preserve">    timeout_seconds: float</w:t>
-      </w:r>
-      <w:r>
-        <w:rPr>
-          <w:rFonts w:ascii="Consolas" w:hAnsi="Consolas"/>
-          <w:sz w:val="15"/>
-        </w:rPr>
-        <w:br/>
-      </w:r>
-      <w:r>
-        <w:rPr>
-          <w:rFonts w:ascii="Consolas" w:hAnsi="Consolas"/>
-          <w:sz w:val="15"/>
-        </w:rPr>
+        <w:br/>
         <w:br/>
         <w:t>stop_policy = StopPolicy(max_trials=20)</w:t>
-      </w:r>
-      <w:r>
-        <w:rPr>
-          <w:rFonts w:ascii="Consolas" w:hAnsi="Consolas"/>
-          <w:sz w:val="15"/>
-        </w:rPr>
         <w:br/>
         <w:t>worker_spec = WorkerSpec(</w:t>
-      </w:r>
-      <w:r>
-        <w:rPr>
-          <w:rFonts w:ascii="Consolas" w:hAnsi="Consolas"/>
-          <w:sz w:val="15"/>
-        </w:rPr>
         <w:br/>
         <w:t xml:space="preserve">    command=(</w:t>
-      </w:r>
-      <w:r>
-        <w:rPr>
-          <w:rFonts w:ascii="Consolas" w:hAnsi="Consolas"/>
-          <w:sz w:val="15"/>
-        </w:rPr>
         <w:br/>
         <w:t xml:space="preserve">        sys.executable,</w:t>
-      </w:r>
-      <w:r>
-        <w:rPr>
-          <w:rFonts w:ascii="Consolas" w:hAnsi="Consolas"/>
-          <w:sz w:val="15"/>
-        </w:rPr>
         <w:br/>
         <w:t xml:space="preserve">        "examples/iris_torch/worker.py",</w:t>
-      </w:r>
-      <w:r>
-        <w:rPr>
-          <w:rFonts w:ascii="Consolas" w:hAnsi="Consolas"/>
-          <w:sz w:val="15"/>
-        </w:rPr>
         <w:br/>
         <w:t xml:space="preserve">    ),</w:t>
-      </w:r>
-      <w:r>
-        <w:rPr>
-          <w:rFonts w:ascii="Consolas" w:hAnsi="Consolas"/>
-          <w:sz w:val="15"/>
-        </w:rPr>
         <w:br/>
         <w:t xml:space="preserve">    metrics_argument="--metrics-out",</w:t>
-      </w:r>
-      <w:r>
-        <w:rPr>
-          <w:rFonts w:ascii="Consolas" w:hAnsi="Consolas"/>
-          <w:sz w:val="15"/>
-        </w:rPr>
         <w:br/>
         <w:t xml:space="preserve">    timeout_seconds=120.0,</w:t>
-      </w:r>
-      <w:r>
-        <w:rPr>
-          <w:rFonts w:ascii="Consolas" w:hAnsi="Consolas"/>
-          <w:sz w:val="15"/>
-        </w:rPr>
         <w:br/>
         <w:t>)</w:t>
       </w:r>
@@ -5559,91 +5108,25 @@
           <w:sz w:val="15"/>
         </w:rPr>
         <w:t>@dataclass(frozen=True, slots=True)</w:t>
-      </w:r>
-      <w:r>
-        <w:rPr>
-          <w:rFonts w:ascii="Consolas" w:hAnsi="Consolas"/>
-          <w:sz w:val="15"/>
-        </w:rPr>
         <w:br/>
         <w:t>class CandidateConfiguration:</w:t>
-      </w:r>
-      <w:r>
-        <w:rPr>
-          <w:rFonts w:ascii="Consolas" w:hAnsi="Consolas"/>
-          <w:sz w:val="15"/>
-        </w:rPr>
         <w:br/>
         <w:t xml:space="preserve">    parameters: Mapping[str, ParameterValue]</w:t>
-      </w:r>
-      <w:r>
-        <w:rPr>
-          <w:rFonts w:ascii="Consolas" w:hAnsi="Consolas"/>
-          <w:sz w:val="15"/>
-        </w:rPr>
-        <w:br/>
-      </w:r>
-      <w:r>
-        <w:rPr>
-          <w:rFonts w:ascii="Consolas" w:hAnsi="Consolas"/>
-          <w:sz w:val="15"/>
-        </w:rPr>
+        <w:br/>
         <w:br/>
         <w:t>candidate = CandidateConfiguration(</w:t>
-      </w:r>
-      <w:r>
-        <w:rPr>
-          <w:rFonts w:ascii="Consolas" w:hAnsi="Consolas"/>
-          <w:sz w:val="15"/>
-        </w:rPr>
         <w:br/>
         <w:t xml:space="preserve">    parameters={</w:t>
-      </w:r>
-      <w:r>
-        <w:rPr>
-          <w:rFonts w:ascii="Consolas" w:hAnsi="Consolas"/>
-          <w:sz w:val="15"/>
-        </w:rPr>
         <w:br/>
         <w:t xml:space="preserve">        "learning_rate": 0.0125,</w:t>
-      </w:r>
-      <w:r>
-        <w:rPr>
-          <w:rFonts w:ascii="Consolas" w:hAnsi="Consolas"/>
-          <w:sz w:val="15"/>
-        </w:rPr>
         <w:br/>
         <w:t xml:space="preserve">        "hidden_size": 64,</w:t>
-      </w:r>
-      <w:r>
-        <w:rPr>
-          <w:rFonts w:ascii="Consolas" w:hAnsi="Consolas"/>
-          <w:sz w:val="15"/>
-        </w:rPr>
         <w:br/>
         <w:t xml:space="preserve">        "epochs": 25,</w:t>
-      </w:r>
-      <w:r>
-        <w:rPr>
-          <w:rFonts w:ascii="Consolas" w:hAnsi="Consolas"/>
-          <w:sz w:val="15"/>
-        </w:rPr>
         <w:br/>
         <w:t xml:space="preserve">        "batch_size": 16,</w:t>
-      </w:r>
-      <w:r>
-        <w:rPr>
-          <w:rFonts w:ascii="Consolas" w:hAnsi="Consolas"/>
-          <w:sz w:val="15"/>
-        </w:rPr>
         <w:br/>
         <w:t xml:space="preserve">    },</w:t>
-      </w:r>
-      <w:r>
-        <w:rPr>
-          <w:rFonts w:ascii="Consolas" w:hAnsi="Consolas"/>
-          <w:sz w:val="15"/>
-        </w:rPr>
         <w:br/>
         <w:t>)</w:t>
       </w:r>
@@ -5693,228 +5176,60 @@
           <w:sz w:val="15"/>
         </w:rPr>
         <w:t>{</w:t>
-      </w:r>
-      <w:r>
-        <w:rPr>
-          <w:rFonts w:ascii="Consolas" w:hAnsi="Consolas"/>
-          <w:sz w:val="15"/>
-        </w:rPr>
         <w:br/>
         <w:t xml:space="preserve">  "worker": {</w:t>
-      </w:r>
-      <w:r>
-        <w:rPr>
-          <w:rFonts w:ascii="Consolas" w:hAnsi="Consolas"/>
-          <w:sz w:val="15"/>
-        </w:rPr>
         <w:br/>
         <w:t xml:space="preserve">    "command": ["python", "worker.py"],</w:t>
-      </w:r>
-      <w:r>
-        <w:rPr>
-          <w:rFonts w:ascii="Consolas" w:hAnsi="Consolas"/>
-          <w:sz w:val="15"/>
-        </w:rPr>
         <w:br/>
         <w:t xml:space="preserve">    "metrics_argument": "--metrics-out",</w:t>
-      </w:r>
-      <w:r>
-        <w:rPr>
-          <w:rFonts w:ascii="Consolas" w:hAnsi="Consolas"/>
-          <w:sz w:val="15"/>
-        </w:rPr>
         <w:br/>
         <w:t xml:space="preserve">    "timeout_seconds": 120.0</w:t>
-      </w:r>
-      <w:r>
-        <w:rPr>
-          <w:rFonts w:ascii="Consolas" w:hAnsi="Consolas"/>
-          <w:sz w:val="15"/>
-        </w:rPr>
         <w:br/>
         <w:t xml:space="preserve">  },</w:t>
-      </w:r>
-      <w:r>
-        <w:rPr>
-          <w:rFonts w:ascii="Consolas" w:hAnsi="Consolas"/>
-          <w:sz w:val="15"/>
-        </w:rPr>
         <w:br/>
         <w:t xml:space="preserve">  "optimization": {</w:t>
-      </w:r>
-      <w:r>
-        <w:rPr>
-          <w:rFonts w:ascii="Consolas" w:hAnsi="Consolas"/>
-          <w:sz w:val="15"/>
-        </w:rPr>
         <w:br/>
         <w:t xml:space="preserve">    "parameters": [</w:t>
-      </w:r>
-      <w:r>
-        <w:rPr>
-          <w:rFonts w:ascii="Consolas" w:hAnsi="Consolas"/>
-          <w:sz w:val="15"/>
-        </w:rPr>
         <w:br/>
         <w:t xml:space="preserve">      {"name": "learning_rate", "kind": "float",</w:t>
-      </w:r>
-      <w:r>
-        <w:rPr>
-          <w:rFonts w:ascii="Consolas" w:hAnsi="Consolas"/>
-          <w:sz w:val="15"/>
-        </w:rPr>
         <w:br/>
         <w:t xml:space="preserve">       "minimum": 0.0001, "maximum": 0.1},</w:t>
-      </w:r>
-      <w:r>
-        <w:rPr>
-          <w:rFonts w:ascii="Consolas" w:hAnsi="Consolas"/>
-          <w:sz w:val="15"/>
-        </w:rPr>
         <w:br/>
         <w:t xml:space="preserve">      {"name": "hidden_size", "kind": "integer",</w:t>
-      </w:r>
-      <w:r>
-        <w:rPr>
-          <w:rFonts w:ascii="Consolas" w:hAnsi="Consolas"/>
-          <w:sz w:val="15"/>
-        </w:rPr>
         <w:br/>
         <w:t xml:space="preserve">       "minimum": 4, "maximum": 128},</w:t>
-      </w:r>
-      <w:r>
-        <w:rPr>
-          <w:rFonts w:ascii="Consolas" w:hAnsi="Consolas"/>
-          <w:sz w:val="15"/>
-        </w:rPr>
         <w:br/>
         <w:t xml:space="preserve">      {"name": "epochs", "kind": "integer",</w:t>
-      </w:r>
-      <w:r>
-        <w:rPr>
-          <w:rFonts w:ascii="Consolas" w:hAnsi="Consolas"/>
-          <w:sz w:val="15"/>
-        </w:rPr>
         <w:br/>
         <w:t xml:space="preserve">       "minimum": 5, "maximum": 100},</w:t>
-      </w:r>
-      <w:r>
-        <w:rPr>
-          <w:rFonts w:ascii="Consolas" w:hAnsi="Consolas"/>
-          <w:sz w:val="15"/>
-        </w:rPr>
         <w:br/>
         <w:t xml:space="preserve">      {"name": "batch_size", "kind": "categorical",</w:t>
-      </w:r>
-      <w:r>
-        <w:rPr>
-          <w:rFonts w:ascii="Consolas" w:hAnsi="Consolas"/>
-          <w:sz w:val="15"/>
-        </w:rPr>
         <w:br/>
         <w:t xml:space="preserve">       "choices": [8, 16, 32]}</w:t>
-      </w:r>
-      <w:r>
-        <w:rPr>
-          <w:rFonts w:ascii="Consolas" w:hAnsi="Consolas"/>
-          <w:sz w:val="15"/>
-        </w:rPr>
         <w:br/>
         <w:t xml:space="preserve">    ],</w:t>
-      </w:r>
-      <w:r>
-        <w:rPr>
-          <w:rFonts w:ascii="Consolas" w:hAnsi="Consolas"/>
-          <w:sz w:val="15"/>
-        </w:rPr>
         <w:br/>
         <w:t xml:space="preserve">    "objectives": [</w:t>
-      </w:r>
-      <w:r>
-        <w:rPr>
-          <w:rFonts w:ascii="Consolas" w:hAnsi="Consolas"/>
-          <w:sz w:val="15"/>
-        </w:rPr>
         <w:br/>
         <w:t xml:space="preserve">      {"metric_name": "validation_accuracy",</w:t>
-      </w:r>
-      <w:r>
-        <w:rPr>
-          <w:rFonts w:ascii="Consolas" w:hAnsi="Consolas"/>
-          <w:sz w:val="15"/>
-        </w:rPr>
         <w:br/>
         <w:t xml:space="preserve">       "direction": "maximize"},</w:t>
-      </w:r>
-      <w:r>
-        <w:rPr>
-          <w:rFonts w:ascii="Consolas" w:hAnsi="Consolas"/>
-          <w:sz w:val="15"/>
-        </w:rPr>
         <w:br/>
         <w:t xml:space="preserve">      {"metric_name": "validation_loss",</w:t>
-      </w:r>
-      <w:r>
-        <w:rPr>
-          <w:rFonts w:ascii="Consolas" w:hAnsi="Consolas"/>
-          <w:sz w:val="15"/>
-        </w:rPr>
         <w:br/>
         <w:t xml:space="preserve">       "direction": "minimize"},</w:t>
-      </w:r>
-      <w:r>
-        <w:rPr>
-          <w:rFonts w:ascii="Consolas" w:hAnsi="Consolas"/>
-          <w:sz w:val="15"/>
-        </w:rPr>
         <w:br/>
         <w:t xml:space="preserve">      {"metric_name": "training_time_seconds",</w:t>
-      </w:r>
-      <w:r>
-        <w:rPr>
-          <w:rFonts w:ascii="Consolas" w:hAnsi="Consolas"/>
-          <w:sz w:val="15"/>
-        </w:rPr>
         <w:br/>
         <w:t xml:space="preserve">       "direction": "minimize"}</w:t>
-      </w:r>
-      <w:r>
-        <w:rPr>
-          <w:rFonts w:ascii="Consolas" w:hAnsi="Consolas"/>
-          <w:sz w:val="15"/>
-        </w:rPr>
         <w:br/>
         <w:t xml:space="preserve">    ]</w:t>
-      </w:r>
-      <w:r>
-        <w:rPr>
-          <w:rFonts w:ascii="Consolas" w:hAnsi="Consolas"/>
-          <w:sz w:val="15"/>
-        </w:rPr>
         <w:br/>
         <w:t xml:space="preserve">  },</w:t>
-      </w:r>
-      <w:r>
-        <w:rPr>
-          <w:rFonts w:ascii="Consolas" w:hAnsi="Consolas"/>
-          <w:sz w:val="15"/>
-        </w:rPr>
         <w:br/>
         <w:t xml:space="preserve">  "algorithm": {"name": "random_search", "seed": 42},</w:t>
-      </w:r>
-      <w:r>
-        <w:rPr>
-          <w:rFonts w:ascii="Consolas" w:hAnsi="Consolas"/>
-          <w:sz w:val="15"/>
-        </w:rPr>
         <w:br/>
         <w:t xml:space="preserve">  "stop_policy": {"max_trials": 20}</w:t>
-      </w:r>
-      <w:r>
-        <w:rPr>
-          <w:rFonts w:ascii="Consolas" w:hAnsi="Consolas"/>
-          <w:sz w:val="15"/>
-        </w:rPr>
         <w:br/>
         <w:t>}</w:t>
       </w:r>
@@ -6687,97 +6002,25 @@
           <w:sz w:val="15"/>
         </w:rPr>
         <w:t>TerminationReason = Literal[</w:t>
-      </w:r>
-      <w:r>
-        <w:rPr>
-          <w:rFonts w:ascii="Consolas" w:hAnsi="Consolas"/>
-          <w:sz w:val="15"/>
-        </w:rPr>
         <w:br/>
         <w:t xml:space="preserve">    "maximum_trials",</w:t>
-      </w:r>
-      <w:r>
-        <w:rPr>
-          <w:rFonts w:ascii="Consolas" w:hAnsi="Consolas"/>
-          <w:sz w:val="15"/>
-        </w:rPr>
         <w:br/>
         <w:t xml:space="preserve">    "search_exhausted",</w:t>
-      </w:r>
-      <w:r>
-        <w:rPr>
-          <w:rFonts w:ascii="Consolas" w:hAnsi="Consolas"/>
-          <w:sz w:val="15"/>
-        </w:rPr>
         <w:br/>
         <w:t xml:space="preserve">    "user_cancelled",</w:t>
-      </w:r>
-      <w:r>
-        <w:rPr>
-          <w:rFonts w:ascii="Consolas" w:hAnsi="Consolas"/>
-          <w:sz w:val="15"/>
-        </w:rPr>
         <w:br/>
         <w:t xml:space="preserve">    "fatal_error",</w:t>
-      </w:r>
-      <w:r>
-        <w:rPr>
-          <w:rFonts w:ascii="Consolas" w:hAnsi="Consolas"/>
-          <w:sz w:val="15"/>
-        </w:rPr>
         <w:br/>
         <w:t>]</w:t>
-      </w:r>
-      <w:r>
-        <w:rPr>
-          <w:rFonts w:ascii="Consolas" w:hAnsi="Consolas"/>
-          <w:sz w:val="15"/>
-        </w:rPr>
-        <w:br/>
-      </w:r>
-      <w:r>
-        <w:rPr>
-          <w:rFonts w:ascii="Consolas" w:hAnsi="Consolas"/>
-          <w:sz w:val="15"/>
-        </w:rPr>
+        <w:br/>
         <w:br/>
         <w:t>@dataclass(frozen=True)</w:t>
-      </w:r>
-      <w:r>
-        <w:rPr>
-          <w:rFonts w:ascii="Consolas" w:hAnsi="Consolas"/>
-          <w:sz w:val="15"/>
-        </w:rPr>
         <w:br/>
         <w:t>class StopDecision:</w:t>
-      </w:r>
-      <w:r>
-        <w:rPr>
-          <w:rFonts w:ascii="Consolas" w:hAnsi="Consolas"/>
-          <w:sz w:val="15"/>
-        </w:rPr>
         <w:br/>
         <w:t xml:space="preserve">    continue_execution: bool</w:t>
-      </w:r>
-      <w:r>
-        <w:rPr>
-          <w:rFonts w:ascii="Consolas" w:hAnsi="Consolas"/>
-          <w:sz w:val="15"/>
-        </w:rPr>
-        <w:br/>
-      </w:r>
-      <w:r>
-        <w:rPr>
-          <w:rFonts w:ascii="Consolas" w:hAnsi="Consolas"/>
-          <w:sz w:val="15"/>
-        </w:rPr>
+        <w:br/>
         <w:t xml:space="preserve">    termination_reason: TerminationReason | None</w:t>
-      </w:r>
-      <w:r>
-        <w:rPr>
-          <w:rFonts w:ascii="Consolas" w:hAnsi="Consolas"/>
-          <w:sz w:val="15"/>
-        </w:rPr>
         <w:br/>
         <w:t xml:space="preserve">    message: str | None = None</w:t>
       </w:r>
@@ -7225,422 +6468,98 @@
           <w:sz w:val="15"/>
         </w:rPr>
         <w:t>state = INITIALIZING</w:t>
-      </w:r>
-      <w:r>
-        <w:rPr>
-          <w:rFonts w:ascii="Consolas" w:hAnsi="Consolas"/>
-          <w:sz w:val="15"/>
-        </w:rPr>
         <w:br/>
         <w:t>termination_reason = None</w:t>
-      </w:r>
-      <w:r>
-        <w:rPr>
-          <w:rFonts w:ascii="Consolas" w:hAnsi="Consolas"/>
-          <w:sz w:val="15"/>
-        </w:rPr>
         <w:br/>
         <w:t>initialize_and_validate()</w:t>
-      </w:r>
-      <w:r>
-        <w:rPr>
-          <w:rFonts w:ascii="Consolas" w:hAnsi="Consolas"/>
-          <w:sz w:val="15"/>
-        </w:rPr>
         <w:br/>
         <w:t>state = SELECTING</w:t>
-      </w:r>
-      <w:r>
-        <w:rPr>
-          <w:rFonts w:ascii="Consolas" w:hAnsi="Consolas"/>
-          <w:sz w:val="15"/>
-        </w:rPr>
-        <w:br/>
-      </w:r>
-      <w:r>
-        <w:rPr>
-          <w:rFonts w:ascii="Consolas" w:hAnsi="Consolas"/>
-          <w:sz w:val="15"/>
-        </w:rPr>
+        <w:br/>
         <w:br/>
         <w:t>while state not in {STOPPED}:</w:t>
-      </w:r>
-      <w:r>
-        <w:rPr>
-          <w:rFonts w:ascii="Consolas" w:hAnsi="Consolas"/>
-          <w:sz w:val="15"/>
-        </w:rPr>
         <w:br/>
         <w:t xml:space="preserve">    if state is SELECTING:</w:t>
-      </w:r>
-      <w:r>
-        <w:rPr>
-          <w:rFonts w:ascii="Consolas" w:hAnsi="Consolas"/>
-          <w:sz w:val="15"/>
-        </w:rPr>
         <w:br/>
         <w:t xml:space="preserve">        proposal = algorithm.propose(contract, history.snapshot())</w:t>
-      </w:r>
-      <w:r>
-        <w:rPr>
-          <w:rFonts w:ascii="Consolas" w:hAnsi="Consolas"/>
-          <w:sz w:val="15"/>
-        </w:rPr>
-        <w:br/>
-      </w:r>
-      <w:r>
-        <w:rPr>
-          <w:rFonts w:ascii="Consolas" w:hAnsi="Consolas"/>
-          <w:sz w:val="15"/>
-        </w:rPr>
+        <w:br/>
         <w:t xml:space="preserve">        if proposal.status == "candidate":</w:t>
-      </w:r>
-      <w:r>
-        <w:rPr>
-          <w:rFonts w:ascii="Consolas" w:hAnsi="Consolas"/>
-          <w:sz w:val="15"/>
-        </w:rPr>
         <w:br/>
         <w:t xml:space="preserve">            state = GATING</w:t>
-      </w:r>
-      <w:r>
-        <w:rPr>
-          <w:rFonts w:ascii="Consolas" w:hAnsi="Consolas"/>
-          <w:sz w:val="15"/>
-        </w:rPr>
         <w:br/>
         <w:t xml:space="preserve">        elif proposal.status == "search_exhausted":</w:t>
-      </w:r>
-      <w:r>
-        <w:rPr>
-          <w:rFonts w:ascii="Consolas" w:hAnsi="Consolas"/>
-          <w:sz w:val="15"/>
-        </w:rPr>
         <w:br/>
         <w:t xml:space="preserve">            termination_reason = "search_exhausted"</w:t>
-      </w:r>
-      <w:r>
-        <w:rPr>
-          <w:rFonts w:ascii="Consolas" w:hAnsi="Consolas"/>
-          <w:sz w:val="15"/>
-        </w:rPr>
         <w:br/>
         <w:t xml:space="preserve">            state = FINALIZING</w:t>
-      </w:r>
-      <w:r>
-        <w:rPr>
-          <w:rFonts w:ascii="Consolas" w:hAnsi="Consolas"/>
-          <w:sz w:val="15"/>
-        </w:rPr>
         <w:br/>
         <w:t xml:space="preserve">        else:</w:t>
-      </w:r>
-      <w:r>
-        <w:rPr>
-          <w:rFonts w:ascii="Consolas" w:hAnsi="Consolas"/>
-          <w:sz w:val="15"/>
-        </w:rPr>
         <w:br/>
         <w:t xml:space="preserve">            termination_reason = "fatal_error"</w:t>
-      </w:r>
-      <w:r>
-        <w:rPr>
-          <w:rFonts w:ascii="Consolas" w:hAnsi="Consolas"/>
-          <w:sz w:val="15"/>
-        </w:rPr>
         <w:br/>
         <w:t xml:space="preserve">            state = FAILED</w:t>
-      </w:r>
-      <w:r>
-        <w:rPr>
-          <w:rFonts w:ascii="Consolas" w:hAnsi="Consolas"/>
-          <w:sz w:val="15"/>
-        </w:rPr>
-        <w:br/>
-      </w:r>
-      <w:r>
-        <w:rPr>
-          <w:rFonts w:ascii="Consolas" w:hAnsi="Consolas"/>
-          <w:sz w:val="15"/>
-        </w:rPr>
+        <w:br/>
         <w:br/>
         <w:t xml:space="preserve">    elif state is GATING:</w:t>
-      </w:r>
-      <w:r>
-        <w:rPr>
-          <w:rFonts w:ascii="Consolas" w:hAnsi="Consolas"/>
-          <w:sz w:val="15"/>
-        </w:rPr>
         <w:br/>
         <w:t xml:space="preserve">        decision = stop_policy.before_trial(history.snapshot())</w:t>
-      </w:r>
-      <w:r>
-        <w:rPr>
-          <w:rFonts w:ascii="Consolas" w:hAnsi="Consolas"/>
-          <w:sz w:val="15"/>
-        </w:rPr>
         <w:br/>
         <w:t xml:space="preserve">        if decision.continue_execution:</w:t>
-      </w:r>
-      <w:r>
-        <w:rPr>
-          <w:rFonts w:ascii="Consolas" w:hAnsi="Consolas"/>
-          <w:sz w:val="15"/>
-        </w:rPr>
         <w:br/>
         <w:t xml:space="preserve">            state = EXECUTING</w:t>
-      </w:r>
-      <w:r>
-        <w:rPr>
-          <w:rFonts w:ascii="Consolas" w:hAnsi="Consolas"/>
-          <w:sz w:val="15"/>
-        </w:rPr>
         <w:br/>
         <w:t xml:space="preserve">        else:</w:t>
-      </w:r>
-      <w:r>
-        <w:rPr>
-          <w:rFonts w:ascii="Consolas" w:hAnsi="Consolas"/>
-          <w:sz w:val="15"/>
-        </w:rPr>
-        <w:br/>
-      </w:r>
-      <w:r>
-        <w:rPr>
-          <w:rFonts w:ascii="Consolas" w:hAnsi="Consolas"/>
-          <w:sz w:val="15"/>
-        </w:rPr>
+        <w:br/>
         <w:t xml:space="preserve">            termination_reason = decision.termination_reason</w:t>
-      </w:r>
-      <w:r>
-        <w:rPr>
-          <w:rFonts w:ascii="Consolas" w:hAnsi="Consolas"/>
-          <w:sz w:val="15"/>
-        </w:rPr>
         <w:br/>
         <w:t xml:space="preserve">            state = FINALIZING</w:t>
-      </w:r>
-      <w:r>
-        <w:rPr>
-          <w:rFonts w:ascii="Consolas" w:hAnsi="Consolas"/>
-          <w:sz w:val="15"/>
-        </w:rPr>
-        <w:br/>
-      </w:r>
-      <w:r>
-        <w:rPr>
-          <w:rFonts w:ascii="Consolas" w:hAnsi="Consolas"/>
-          <w:sz w:val="15"/>
-        </w:rPr>
+        <w:br/>
         <w:br/>
         <w:t xml:space="preserve">    elif state is EXECUTING:</w:t>
-      </w:r>
-      <w:r>
-        <w:rPr>
-          <w:rFonts w:ascii="Consolas" w:hAnsi="Consolas"/>
-          <w:sz w:val="15"/>
-        </w:rPr>
         <w:br/>
         <w:t xml:space="preserve">        observation = runner.execute(worker_spec, proposal.candidate)</w:t>
-      </w:r>
-      <w:r>
-        <w:rPr>
-          <w:rFonts w:ascii="Consolas" w:hAnsi="Consolas"/>
-          <w:sz w:val="15"/>
-        </w:rPr>
         <w:br/>
         <w:t xml:space="preserve">        state = RECORDING</w:t>
-      </w:r>
-      <w:r>
-        <w:rPr>
-          <w:rFonts w:ascii="Consolas" w:hAnsi="Consolas"/>
-          <w:sz w:val="15"/>
-        </w:rPr>
-        <w:br/>
-      </w:r>
-      <w:r>
-        <w:rPr>
-          <w:rFonts w:ascii="Consolas" w:hAnsi="Consolas"/>
-          <w:sz w:val="15"/>
-        </w:rPr>
+        <w:br/>
         <w:br/>
         <w:t xml:space="preserve">    elif state is RECORDING:</w:t>
-      </w:r>
-      <w:r>
-        <w:rPr>
-          <w:rFonts w:ascii="Consolas" w:hAnsi="Consolas"/>
-          <w:sz w:val="15"/>
-        </w:rPr>
         <w:br/>
         <w:t xml:space="preserve">        record = build_trial_record(proposal.candidate, observation)</w:t>
-      </w:r>
-      <w:r>
-        <w:rPr>
-          <w:rFonts w:ascii="Consolas" w:hAnsi="Consolas"/>
-          <w:sz w:val="15"/>
-        </w:rPr>
         <w:br/>
         <w:t xml:space="preserve">        history.append(record)</w:t>
-      </w:r>
-      <w:r>
-        <w:rPr>
-          <w:rFonts w:ascii="Consolas" w:hAnsi="Consolas"/>
-          <w:sz w:val="15"/>
-        </w:rPr>
         <w:br/>
         <w:t xml:space="preserve">        persistence.checkpoint(history.snapshot())</w:t>
-      </w:r>
-      <w:r>
-        <w:rPr>
-          <w:rFonts w:ascii="Consolas" w:hAnsi="Consolas"/>
-          <w:sz w:val="15"/>
-        </w:rPr>
         <w:br/>
         <w:t xml:space="preserve">        state = EVALUATING</w:t>
-      </w:r>
-      <w:r>
-        <w:rPr>
-          <w:rFonts w:ascii="Consolas" w:hAnsi="Consolas"/>
-          <w:sz w:val="15"/>
-        </w:rPr>
-        <w:br/>
-      </w:r>
-      <w:r>
-        <w:rPr>
-          <w:rFonts w:ascii="Consolas" w:hAnsi="Consolas"/>
-          <w:sz w:val="15"/>
-        </w:rPr>
+        <w:br/>
         <w:br/>
         <w:t xml:space="preserve">    elif state is EVALUATING:</w:t>
-      </w:r>
-      <w:r>
-        <w:rPr>
-          <w:rFonts w:ascii="Consolas" w:hAnsi="Consolas"/>
-          <w:sz w:val="15"/>
-        </w:rPr>
-        <w:br/>
-      </w:r>
-      <w:r>
-        <w:rPr>
-          <w:rFonts w:ascii="Consolas" w:hAnsi="Consolas"/>
-          <w:sz w:val="15"/>
-        </w:rPr>
+        <w:br/>
         <w:t xml:space="preserve">        decision = stop_policy.after_trial(history.snapshot())</w:t>
-      </w:r>
-      <w:r>
-        <w:rPr>
-          <w:rFonts w:ascii="Consolas" w:hAnsi="Consolas"/>
-          <w:sz w:val="15"/>
-        </w:rPr>
         <w:br/>
         <w:t xml:space="preserve">        if decision.continue_execution:</w:t>
-      </w:r>
-      <w:r>
-        <w:rPr>
-          <w:rFonts w:ascii="Consolas" w:hAnsi="Consolas"/>
-          <w:sz w:val="15"/>
-        </w:rPr>
         <w:br/>
         <w:t xml:space="preserve">            state = SELECTING</w:t>
-      </w:r>
-      <w:r>
-        <w:rPr>
-          <w:rFonts w:ascii="Consolas" w:hAnsi="Consolas"/>
-          <w:sz w:val="15"/>
-        </w:rPr>
         <w:br/>
         <w:t xml:space="preserve">        else:</w:t>
-      </w:r>
-      <w:r>
-        <w:rPr>
-          <w:rFonts w:ascii="Consolas" w:hAnsi="Consolas"/>
-          <w:sz w:val="15"/>
-        </w:rPr>
         <w:br/>
         <w:t xml:space="preserve">            termination_reason = decision.termination_reason</w:t>
-      </w:r>
-      <w:r>
-        <w:rPr>
-          <w:rFonts w:ascii="Consolas" w:hAnsi="Consolas"/>
-          <w:sz w:val="15"/>
-        </w:rPr>
         <w:br/>
         <w:t xml:space="preserve">            state = FINALIZING</w:t>
-      </w:r>
-      <w:r>
-        <w:rPr>
-          <w:rFonts w:ascii="Consolas" w:hAnsi="Consolas"/>
-          <w:sz w:val="15"/>
-        </w:rPr>
-        <w:br/>
-      </w:r>
-      <w:r>
-        <w:rPr>
-          <w:rFonts w:ascii="Consolas" w:hAnsi="Consolas"/>
-          <w:sz w:val="15"/>
-        </w:rPr>
+        <w:br/>
         <w:br/>
         <w:t xml:space="preserve">    elif state is FAILED:</w:t>
-      </w:r>
-      <w:r>
-        <w:rPr>
-          <w:rFonts w:ascii="Consolas" w:hAnsi="Consolas"/>
-          <w:sz w:val="15"/>
-        </w:rPr>
         <w:br/>
         <w:t xml:space="preserve">        termination_reason = termination_reason or "fatal_error"</w:t>
-      </w:r>
-      <w:r>
-        <w:rPr>
-          <w:rFonts w:ascii="Consolas" w:hAnsi="Consolas"/>
-          <w:sz w:val="15"/>
-        </w:rPr>
         <w:br/>
         <w:t xml:space="preserve">        state = FINALIZING</w:t>
-      </w:r>
-      <w:r>
-        <w:rPr>
-          <w:rFonts w:ascii="Consolas" w:hAnsi="Consolas"/>
-          <w:sz w:val="15"/>
-        </w:rPr>
-        <w:br/>
-      </w:r>
-      <w:r>
-        <w:rPr>
-          <w:rFonts w:ascii="Consolas" w:hAnsi="Consolas"/>
-          <w:sz w:val="15"/>
-        </w:rPr>
+        <w:br/>
         <w:br/>
         <w:t xml:space="preserve">    elif state is FINALIZING:</w:t>
-      </w:r>
-      <w:r>
-        <w:rPr>
-          <w:rFonts w:ascii="Consolas" w:hAnsi="Consolas"/>
-          <w:sz w:val="15"/>
-        </w:rPr>
         <w:br/>
         <w:t xml:space="preserve">        result = finalize(contract, history.snapshot(), termination_reason)</w:t>
-      </w:r>
-      <w:r>
-        <w:rPr>
-          <w:rFonts w:ascii="Consolas" w:hAnsi="Consolas"/>
-          <w:sz w:val="15"/>
-        </w:rPr>
         <w:br/>
         <w:t xml:space="preserve">        reporter.write(result)</w:t>
-      </w:r>
-      <w:r>
-        <w:rPr>
-          <w:rFonts w:ascii="Consolas" w:hAnsi="Consolas"/>
-          <w:sz w:val="15"/>
-        </w:rPr>
-        <w:br/>
-      </w:r>
-      <w:r>
-        <w:rPr>
-          <w:rFonts w:ascii="Consolas" w:hAnsi="Consolas"/>
-          <w:sz w:val="15"/>
-        </w:rPr>
+        <w:br/>
         <w:t xml:space="preserve">        state = STOPPED</w:t>
       </w:r>
     </w:p>
@@ -7661,13 +6580,6 @@
           <w:sz w:val="17"/>
         </w:rPr>
         <w:t>NO PUBLIC EXECUTIONDATA DOMAIN OBJECT</w:t>
-      </w:r>
-      <w:r>
-        <w:rPr>
-          <w:b/>
-          <w:color w:val="2E74B5"/>
-          <w:sz w:val="17"/>
-        </w:rPr>
         <w:br/>
       </w:r>
       <w:r>
@@ -7791,76 +6703,22 @@
           <w:sz w:val="15"/>
         </w:rPr>
         <w:t>[</w:t>
-      </w:r>
-      <w:r>
-        <w:rPr>
-          <w:rFonts w:ascii="Consolas" w:hAnsi="Consolas"/>
-          <w:sz w:val="15"/>
-        </w:rPr>
         <w:br/>
         <w:t xml:space="preserve">    sys.executable,</w:t>
-      </w:r>
-      <w:r>
-        <w:rPr>
-          <w:rFonts w:ascii="Consolas" w:hAnsi="Consolas"/>
-          <w:sz w:val="15"/>
-        </w:rPr>
         <w:br/>
         <w:t xml:space="preserve">    "examples/iris_torch/worker.py",</w:t>
-      </w:r>
-      <w:r>
-        <w:rPr>
-          <w:rFonts w:ascii="Consolas" w:hAnsi="Consolas"/>
-          <w:sz w:val="15"/>
-        </w:rPr>
         <w:br/>
         <w:t xml:space="preserve">    "--learning-rate", "0.0125",</w:t>
-      </w:r>
-      <w:r>
-        <w:rPr>
-          <w:rFonts w:ascii="Consolas" w:hAnsi="Consolas"/>
-          <w:sz w:val="15"/>
-        </w:rPr>
         <w:br/>
         <w:t xml:space="preserve">    "--hidden-size", "64",</w:t>
-      </w:r>
-      <w:r>
-        <w:rPr>
-          <w:rFonts w:ascii="Consolas" w:hAnsi="Consolas"/>
-          <w:sz w:val="15"/>
-        </w:rPr>
         <w:br/>
         <w:t xml:space="preserve">    "--epochs", "25",</w:t>
-      </w:r>
-      <w:r>
-        <w:rPr>
-          <w:rFonts w:ascii="Consolas" w:hAnsi="Consolas"/>
-          <w:sz w:val="15"/>
-        </w:rPr>
         <w:br/>
         <w:t xml:space="preserve">    "--batch-size", "16",</w:t>
-      </w:r>
-      <w:r>
-        <w:rPr>
-          <w:rFonts w:ascii="Consolas" w:hAnsi="Consolas"/>
-          <w:sz w:val="15"/>
-        </w:rPr>
         <w:br/>
         <w:t xml:space="preserve">    "--metrics-out",</w:t>
-      </w:r>
-      <w:r>
-        <w:rPr>
-          <w:rFonts w:ascii="Consolas" w:hAnsi="Consolas"/>
-          <w:sz w:val="15"/>
-        </w:rPr>
         <w:br/>
         <w:t xml:space="preserve">    "/.../trials/trial_0007/metrics.csv",</w:t>
-      </w:r>
-      <w:r>
-        <w:rPr>
-          <w:rFonts w:ascii="Consolas" w:hAnsi="Consolas"/>
-          <w:sz w:val="15"/>
-        </w:rPr>
         <w:br/>
         <w:t>]</w:t>
       </w:r>
@@ -7950,48 +6808,8 @@
           <w:rFonts w:ascii="Consolas" w:hAnsi="Consolas"/>
           <w:sz w:val="15"/>
         </w:rPr>
-        <w:t>validation_accuracy</w:t>
-      </w:r>
-      <w:r>
-        <w:rPr>
-          <w:rFonts w:ascii="Consolas" w:hAnsi="Consolas"/>
-          <w:sz w:val="15"/>
-        </w:rPr>
-        <w:t>,</w:t>
-      </w:r>
-      <w:r>
-        <w:rPr>
-          <w:rFonts w:ascii="Consolas" w:hAnsi="Consolas"/>
-          <w:sz w:val="15"/>
-        </w:rPr>
-        <w:t>validation_loss</w:t>
-      </w:r>
-      <w:r>
-        <w:rPr>
-          <w:rFonts w:ascii="Consolas" w:hAnsi="Consolas"/>
-          <w:sz w:val="15"/>
-        </w:rPr>
-        <w:t>,</w:t>
-      </w:r>
-      <w:r>
-        <w:rPr>
-          <w:rFonts w:ascii="Consolas" w:hAnsi="Consolas"/>
-          <w:sz w:val="15"/>
-        </w:rPr>
-        <w:t>training_time_seconds</w:t>
-      </w:r>
-      <w:r>
-        <w:rPr>
-          <w:rFonts w:ascii="Consolas" w:hAnsi="Consolas"/>
-          <w:sz w:val="15"/>
-        </w:rPr>
-        <w:br/>
-      </w:r>
-      <w:r>
-        <w:rPr>
-          <w:rFonts w:ascii="Consolas" w:hAnsi="Consolas"/>
-          <w:sz w:val="15"/>
-        </w:rPr>
+        <w:t>validation_accuracy,validation_loss,training_time_seconds</w:t>
+        <w:br/>
         <w:t>0.9142,0.1837,1.284</w:t>
       </w:r>
     </w:p>
@@ -8309,184 +7127,46 @@
           <w:sz w:val="15"/>
         </w:rPr>
         <w:t>ExecutionStatus = Literal[</w:t>
-      </w:r>
-      <w:r>
-        <w:rPr>
-          <w:rFonts w:ascii="Consolas" w:hAnsi="Consolas"/>
-          <w:sz w:val="15"/>
-        </w:rPr>
         <w:br/>
         <w:t xml:space="preserve">    "completed", "process_failed", "timed_out",</w:t>
-      </w:r>
-      <w:r>
-        <w:rPr>
-          <w:rFonts w:ascii="Consolas" w:hAnsi="Consolas"/>
-          <w:sz w:val="15"/>
-        </w:rPr>
         <w:br/>
         <w:t xml:space="preserve">    "launch_failed", "cancelled"</w:t>
-      </w:r>
-      <w:r>
-        <w:rPr>
-          <w:rFonts w:ascii="Consolas" w:hAnsi="Consolas"/>
-          <w:sz w:val="15"/>
-        </w:rPr>
         <w:br/>
         <w:t>]</w:t>
-      </w:r>
-      <w:r>
-        <w:rPr>
-          <w:rFonts w:ascii="Consolas" w:hAnsi="Consolas"/>
-          <w:sz w:val="15"/>
-        </w:rPr>
         <w:br/>
         <w:t>MetricsStatus = Literal[</w:t>
-      </w:r>
-      <w:r>
-        <w:rPr>
-          <w:rFonts w:ascii="Consolas" w:hAnsi="Consolas"/>
-          <w:sz w:val="15"/>
-        </w:rPr>
         <w:br/>
         <w:t xml:space="preserve">    "valid", "missing", "malformed", "nonfinite"</w:t>
-      </w:r>
-      <w:r>
-        <w:rPr>
-          <w:rFonts w:ascii="Consolas" w:hAnsi="Consolas"/>
-          <w:sz w:val="15"/>
-        </w:rPr>
         <w:br/>
         <w:t>]</w:t>
-      </w:r>
-      <w:r>
-        <w:rPr>
-          <w:rFonts w:ascii="Consolas" w:hAnsi="Consolas"/>
-          <w:sz w:val="15"/>
-        </w:rPr>
-        <w:br/>
-      </w:r>
-      <w:r>
-        <w:rPr>
-          <w:rFonts w:ascii="Consolas" w:hAnsi="Consolas"/>
-          <w:sz w:val="15"/>
-        </w:rPr>
+        <w:br/>
         <w:br/>
         <w:t>@dataclass(frozen=True)</w:t>
-      </w:r>
-      <w:r>
-        <w:rPr>
-          <w:rFonts w:ascii="Consolas" w:hAnsi="Consolas"/>
-          <w:sz w:val="15"/>
-        </w:rPr>
         <w:br/>
         <w:t>class TrialRecord:</w:t>
-      </w:r>
-      <w:r>
-        <w:rPr>
-          <w:rFonts w:ascii="Consolas" w:hAnsi="Consolas"/>
-          <w:sz w:val="15"/>
-        </w:rPr>
         <w:br/>
         <w:t xml:space="preserve">    trial_id: int</w:t>
-      </w:r>
-      <w:r>
-        <w:rPr>
-          <w:rFonts w:ascii="Consolas" w:hAnsi="Consolas"/>
-          <w:sz w:val="15"/>
-        </w:rPr>
         <w:br/>
         <w:t xml:space="preserve">    parameters: Mapping[str, ParameterValue]</w:t>
-      </w:r>
-      <w:r>
-        <w:rPr>
-          <w:rFonts w:ascii="Consolas" w:hAnsi="Consolas"/>
-          <w:sz w:val="15"/>
-        </w:rPr>
         <w:br/>
         <w:t xml:space="preserve">    metrics: Mapping[str, float]</w:t>
-      </w:r>
-      <w:r>
-        <w:rPr>
-          <w:rFonts w:ascii="Consolas" w:hAnsi="Consolas"/>
-          <w:sz w:val="15"/>
-        </w:rPr>
         <w:br/>
         <w:t xml:space="preserve">    execution_status: ExecutionStatus</w:t>
-      </w:r>
-      <w:r>
-        <w:rPr>
-          <w:rFonts w:ascii="Consolas" w:hAnsi="Consolas"/>
-          <w:sz w:val="15"/>
-        </w:rPr>
         <w:br/>
         <w:t xml:space="preserve">    metrics_status: MetricsStatus</w:t>
-      </w:r>
-      <w:r>
-        <w:rPr>
-          <w:rFonts w:ascii="Consolas" w:hAnsi="Consolas"/>
-          <w:sz w:val="15"/>
-        </w:rPr>
-        <w:br/>
-      </w:r>
-      <w:r>
-        <w:rPr>
-          <w:rFonts w:ascii="Consolas" w:hAnsi="Consolas"/>
-          <w:sz w:val="15"/>
-        </w:rPr>
+        <w:br/>
         <w:t xml:space="preserve">    runtime_seconds: float</w:t>
-      </w:r>
-      <w:r>
-        <w:rPr>
-          <w:rFonts w:ascii="Consolas" w:hAnsi="Consolas"/>
-          <w:sz w:val="15"/>
-        </w:rPr>
         <w:br/>
         <w:t xml:space="preserve">    exit_code: int | None</w:t>
-      </w:r>
-      <w:r>
-        <w:rPr>
-          <w:rFonts w:ascii="Consolas" w:hAnsi="Consolas"/>
-          <w:sz w:val="15"/>
-        </w:rPr>
         <w:br/>
         <w:t xml:space="preserve">    timed_out: bool</w:t>
-      </w:r>
-      <w:r>
-        <w:rPr>
-          <w:rFonts w:ascii="Consolas" w:hAnsi="Consolas"/>
-          <w:sz w:val="15"/>
-        </w:rPr>
         <w:br/>
         <w:t xml:space="preserve">    error_message: str | None = None</w:t>
-      </w:r>
-      <w:r>
-        <w:rPr>
-          <w:rFonts w:ascii="Consolas" w:hAnsi="Consolas"/>
-          <w:sz w:val="15"/>
-        </w:rPr>
-        <w:br/>
-      </w:r>
-      <w:r>
-        <w:rPr>
-          <w:rFonts w:ascii="Consolas" w:hAnsi="Consolas"/>
-          <w:sz w:val="15"/>
-        </w:rPr>
+        <w:br/>
         <w:br/>
         <w:t xml:space="preserve">    @property</w:t>
-      </w:r>
-      <w:r>
-        <w:rPr>
-          <w:rFonts w:ascii="Consolas" w:hAnsi="Consolas"/>
-          <w:sz w:val="15"/>
-        </w:rPr>
         <w:br/>
         <w:t xml:space="preserve">    def execution_succeeded(self) -&gt; bool:</w:t>
-      </w:r>
-      <w:r>
-        <w:rPr>
-          <w:rFonts w:ascii="Consolas" w:hAnsi="Consolas"/>
-          <w:sz w:val="15"/>
-        </w:rPr>
         <w:br/>
         <w:t xml:space="preserve">        return self.execution_status == "completed"</w:t>
       </w:r>
@@ -8522,315 +7202,55 @@
           <w:sz w:val="14"/>
         </w:rPr>
         <w:t># Execution-successful and eligible under the example contract</w:t>
-      </w:r>
-      <w:r>
-        <w:rPr>
-          <w:rFonts w:ascii="Consolas" w:hAnsi="Consolas"/>
-          <w:sz w:val="14"/>
-        </w:rPr>
         <w:br/>
         <w:t>TrialRecord(</w:t>
-      </w:r>
-      <w:r>
-        <w:rPr>
-          <w:rFonts w:ascii="Consolas" w:hAnsi="Consolas"/>
-          <w:sz w:val="14"/>
-        </w:rPr>
         <w:br/>
         <w:t xml:space="preserve">    trial_id=7,</w:t>
-      </w:r>
-      <w:r>
-        <w:rPr>
-          <w:rFonts w:ascii="Consolas" w:hAnsi="Consolas"/>
-          <w:sz w:val="14"/>
-        </w:rPr>
         <w:br/>
         <w:t xml:space="preserve">    parameters={"learning_rate": 0.0125,</w:t>
-      </w:r>
-      <w:r>
-        <w:rPr>
-          <w:rFonts w:ascii="Consolas" w:hAnsi="Consolas"/>
-          <w:sz w:val="14"/>
-        </w:rPr>
-        <w:br/>
-        <w:t xml:space="preserve">                </w:t>
-      </w:r>
-      <w:r>
-        <w:rPr>
-          <w:rFonts w:ascii="Consolas" w:hAnsi="Consolas"/>
-          <w:sz w:val="14"/>
-        </w:rPr>
-        <w:t>“hidden_size”: 64, “epochs”: 25, “batch_size”: 16</w:t>
-      </w:r>
-      <w:r>
-        <w:rPr>
-          <w:rFonts w:ascii="Consolas" w:hAnsi="Consolas"/>
-          <w:sz w:val="14"/>
-        </w:rPr>
-        <w:t>},</w:t>
-      </w:r>
-      <w:r>
-        <w:rPr>
-          <w:rFonts w:ascii="Consolas" w:hAnsi="Consolas"/>
-          <w:sz w:val="14"/>
-        </w:rPr>
-        <w:br/>
-        <w:t xml:space="preserve">    metrics={"</w:t>
-      </w:r>
-      <w:r>
-        <w:rPr>
-          <w:rFonts w:ascii="Consolas" w:hAnsi="Consolas"/>
-          <w:sz w:val="14"/>
-        </w:rPr>
-        <w:t>validation_accuracy</w:t>
-      </w:r>
-      <w:r>
-        <w:rPr>
-          <w:rFonts w:ascii="Consolas" w:hAnsi="Consolas"/>
-          <w:sz w:val="14"/>
-        </w:rPr>
-        <w:t>": 0.9142, "</w:t>
-      </w:r>
-      <w:r>
-        <w:rPr>
-          <w:rFonts w:ascii="Consolas" w:hAnsi="Consolas"/>
-          <w:sz w:val="14"/>
-        </w:rPr>
-        <w:t>validation_loss</w:t>
-      </w:r>
-      <w:r>
-        <w:rPr>
-          <w:rFonts w:ascii="Consolas" w:hAnsi="Consolas"/>
-          <w:sz w:val="14"/>
-        </w:rPr>
-        <w:t>": 0.1837,</w:t>
-      </w:r>
-      <w:r>
-        <w:rPr>
-          <w:rFonts w:ascii="Consolas" w:hAnsi="Consolas"/>
-          <w:sz w:val="14"/>
-        </w:rPr>
-        <w:br/>
-        <w:t xml:space="preserve">             "</w:t>
-      </w:r>
-      <w:r>
-        <w:rPr>
-          <w:rFonts w:ascii="Consolas" w:hAnsi="Consolas"/>
-          <w:sz w:val="14"/>
-        </w:rPr>
-        <w:t>training_time_seconds</w:t>
-      </w:r>
-      <w:r>
-        <w:rPr>
-          <w:rFonts w:ascii="Consolas" w:hAnsi="Consolas"/>
-          <w:sz w:val="14"/>
-        </w:rPr>
-        <w:t>": 1.284},</w:t>
-      </w:r>
-      <w:r>
-        <w:rPr>
-          <w:rFonts w:ascii="Consolas" w:hAnsi="Consolas"/>
-          <w:sz w:val="14"/>
-        </w:rPr>
+        <w:br/>
+        <w:t xml:space="preserve">                “hidden_size”: 64, “epochs”: 25, “batch_size”: 16},</w:t>
+        <w:br/>
+        <w:t xml:space="preserve">    metrics={"validation_accuracy": 0.9142, "validation_loss": 0.1837,</w:t>
+        <w:br/>
+        <w:t xml:space="preserve">             "training_time_seconds": 1.284},</w:t>
         <w:br/>
         <w:t xml:space="preserve">    execution_status="completed",</w:t>
-      </w:r>
-      <w:r>
-        <w:rPr>
-          <w:rFonts w:ascii="Consolas" w:hAnsi="Consolas"/>
-          <w:sz w:val="14"/>
-        </w:rPr>
         <w:br/>
         <w:t xml:space="preserve">    metrics_status="valid",</w:t>
-      </w:r>
-      <w:r>
-        <w:rPr>
-          <w:rFonts w:ascii="Consolas" w:hAnsi="Consolas"/>
-          <w:sz w:val="14"/>
-        </w:rPr>
         <w:br/>
         <w:t xml:space="preserve">    runtime_seconds=1.331,</w:t>
-      </w:r>
-      <w:r>
-        <w:rPr>
-          <w:rFonts w:ascii="Consolas" w:hAnsi="Consolas"/>
-          <w:sz w:val="14"/>
-        </w:rPr>
         <w:br/>
         <w:t xml:space="preserve">    exit_code=0,</w:t>
-      </w:r>
-      <w:r>
-        <w:rPr>
-          <w:rFonts w:ascii="Consolas" w:hAnsi="Consolas"/>
-          <w:sz w:val="14"/>
-        </w:rPr>
         <w:br/>
         <w:t xml:space="preserve">    timed_out=False,</w:t>
-      </w:r>
-      <w:r>
-        <w:rPr>
-          <w:rFonts w:ascii="Consolas" w:hAnsi="Consolas"/>
-          <w:sz w:val="14"/>
-        </w:rPr>
         <w:br/>
         <w:t>)</w:t>
-      </w:r>
-      <w:r>
-        <w:rPr>
-          <w:rFonts w:ascii="Consolas" w:hAnsi="Consolas"/>
-          <w:sz w:val="14"/>
-        </w:rPr>
-        <w:br/>
-      </w:r>
-      <w:r>
-        <w:rPr>
-          <w:rFonts w:ascii="Consolas" w:hAnsi="Consolas"/>
-          <w:sz w:val="14"/>
-        </w:rPr>
+        <w:br/>
         <w:br/>
         <w:t># Timed out; still immutable evidence of an attempted trial</w:t>
-      </w:r>
-      <w:r>
-        <w:rPr>
-          <w:rFonts w:ascii="Consolas" w:hAnsi="Consolas"/>
-          <w:sz w:val="14"/>
-        </w:rPr>
         <w:br/>
         <w:t>TrialRecord(</w:t>
-      </w:r>
-      <w:r>
-        <w:rPr>
-          <w:rFonts w:ascii="Consolas" w:hAnsi="Consolas"/>
-          <w:sz w:val="14"/>
-        </w:rPr>
-        <w:br/>
-      </w:r>
-      <w:r>
-        <w:rPr>
-          <w:rFonts w:ascii="Consolas" w:hAnsi="Consolas"/>
-          <w:sz w:val="14"/>
-        </w:rPr>
+        <w:br/>
         <w:t xml:space="preserve">    trial_id=8,</w:t>
-      </w:r>
-      <w:r>
-        <w:rPr>
-          <w:rFonts w:ascii="Consolas" w:hAnsi="Consolas"/>
-          <w:sz w:val="14"/>
-        </w:rPr>
         <w:br/>
         <w:t xml:space="preserve">    parameters={"learning_rate": 0.09,</w:t>
-      </w:r>
-      <w:r>
-        <w:rPr>
-          <w:rFonts w:ascii="Consolas" w:hAnsi="Consolas"/>
-          <w:sz w:val="14"/>
-        </w:rPr>
-        <w:br/>
-        <w:t xml:space="preserve">                </w:t>
-      </w:r>
-      <w:r>
-        <w:rPr>
-          <w:rFonts w:ascii="Consolas" w:hAnsi="Consolas"/>
-          <w:sz w:val="14"/>
-        </w:rPr>
-        <w:t>“hidden_size”: 128, “epochs”: 100, “batch_size”: 32</w:t>
-      </w:r>
-      <w:r>
-        <w:rPr>
-          <w:rFonts w:ascii="Consolas" w:hAnsi="Consolas"/>
-          <w:sz w:val="14"/>
-        </w:rPr>
-        <w:t>},</w:t>
-      </w:r>
-      <w:r>
-        <w:rPr>
-          <w:rFonts w:ascii="Consolas" w:hAnsi="Consolas"/>
-          <w:sz w:val="14"/>
-        </w:rPr>
+        <w:br/>
+        <w:t xml:space="preserve">                “hidden_size”: 128, “epochs”: 100, “batch_size”: 32},</w:t>
         <w:br/>
         <w:t xml:space="preserve">    metrics={},</w:t>
-      </w:r>
-      <w:r>
-        <w:rPr>
-          <w:rFonts w:ascii="Consolas" w:hAnsi="Consolas"/>
-          <w:sz w:val="14"/>
-        </w:rPr>
         <w:br/>
         <w:t xml:space="preserve">    execution_status="timed_out",</w:t>
-      </w:r>
-      <w:r>
-        <w:rPr>
-          <w:rFonts w:ascii="Consolas" w:hAnsi="Consolas"/>
-          <w:sz w:val="14"/>
-        </w:rPr>
         <w:br/>
         <w:t xml:space="preserve">    metrics_status="missing",</w:t>
-      </w:r>
-      <w:r>
-        <w:rPr>
-          <w:rFonts w:ascii="Consolas" w:hAnsi="Consolas"/>
-          <w:sz w:val="14"/>
-        </w:rPr>
-        <w:br/>
-        <w:t xml:space="preserve">    </w:t>
-      </w:r>
-      <w:r>
-        <w:rPr>
-          <w:rFonts w:ascii="Consolas" w:hAnsi="Consolas"/>
-          <w:sz w:val="14"/>
-        </w:rPr>
-        <w:t>runtime_seconds=120.002</w:t>
-      </w:r>
-      <w:r>
-        <w:rPr>
-          <w:rFonts w:ascii="Consolas" w:hAnsi="Consolas"/>
-          <w:sz w:val="14"/>
-        </w:rPr>
-        <w:t>,</w:t>
-      </w:r>
-      <w:r>
-        <w:rPr>
-          <w:rFonts w:ascii="Consolas" w:hAnsi="Consolas"/>
-          <w:sz w:val="14"/>
-        </w:rPr>
+        <w:br/>
+        <w:t xml:space="preserve">    runtime_seconds=120.002,</w:t>
         <w:br/>
         <w:t xml:space="preserve">    exit_code=None,</w:t>
-      </w:r>
-      <w:r>
-        <w:rPr>
-          <w:rFonts w:ascii="Consolas" w:hAnsi="Consolas"/>
-          <w:sz w:val="14"/>
-        </w:rPr>
         <w:br/>
         <w:t xml:space="preserve">    timed_out=True,</w:t>
-      </w:r>
-      <w:r>
-        <w:rPr>
-          <w:rFonts w:ascii="Consolas" w:hAnsi="Consolas"/>
-          <w:sz w:val="14"/>
-        </w:rPr>
-        <w:br/>
-        <w:t xml:space="preserve">    error_message="Worker exceeded </w:t>
-      </w:r>
-      <w:r>
-        <w:rPr>
-          <w:rFonts w:ascii="Consolas" w:hAnsi="Consolas"/>
-          <w:sz w:val="14"/>
-        </w:rPr>
-        <w:t>120.0-second timeout</w:t>
-      </w:r>
-      <w:r>
-        <w:rPr>
-          <w:rFonts w:ascii="Consolas" w:hAnsi="Consolas"/>
-          <w:sz w:val="14"/>
-        </w:rPr>
-        <w:t>",</w:t>
-      </w:r>
-      <w:r>
-        <w:rPr>
-          <w:rFonts w:ascii="Consolas" w:hAnsi="Consolas"/>
-          <w:sz w:val="14"/>
-        </w:rPr>
+        <w:br/>
+        <w:t xml:space="preserve">    error_message="Worker exceeded 120.0-second timeout",</w:t>
         <w:br/>
         <w:t>)</w:t>
       </w:r>
@@ -9564,143 +7984,35 @@
           <w:sz w:val="15"/>
         </w:rPr>
         <w:t>@dataclass(frozen=True)</w:t>
-      </w:r>
-      <w:r>
-        <w:rPr>
-          <w:rFonts w:ascii="Consolas" w:hAnsi="Consolas"/>
-          <w:sz w:val="15"/>
-        </w:rPr>
         <w:br/>
         <w:t>class ProposalResult:</w:t>
-      </w:r>
-      <w:r>
-        <w:rPr>
-          <w:rFonts w:ascii="Consolas" w:hAnsi="Consolas"/>
-          <w:sz w:val="15"/>
-        </w:rPr>
         <w:br/>
         <w:t xml:space="preserve">    status: Literal["candidate", "search_exhausted", "proposal_failed"]</w:t>
-      </w:r>
-      <w:r>
-        <w:rPr>
-          <w:rFonts w:ascii="Consolas" w:hAnsi="Consolas"/>
-          <w:sz w:val="15"/>
-        </w:rPr>
         <w:br/>
         <w:t xml:space="preserve">    candidate: CandidateConfiguration | None = None</w:t>
-      </w:r>
-      <w:r>
-        <w:rPr>
-          <w:rFonts w:ascii="Consolas" w:hAnsi="Consolas"/>
-          <w:sz w:val="15"/>
-        </w:rPr>
         <w:br/>
         <w:t xml:space="preserve">    reason: str | None = None</w:t>
-      </w:r>
-      <w:r>
-        <w:rPr>
-          <w:rFonts w:ascii="Consolas" w:hAnsi="Consolas"/>
-          <w:sz w:val="15"/>
-        </w:rPr>
-        <w:br/>
-      </w:r>
-      <w:r>
-        <w:rPr>
-          <w:rFonts w:ascii="Consolas" w:hAnsi="Consolas"/>
-          <w:sz w:val="15"/>
-        </w:rPr>
+        <w:br/>
         <w:br/>
         <w:t>class SearchAlgorithm(Protocol):</w:t>
-      </w:r>
-      <w:r>
-        <w:rPr>
-          <w:rFonts w:ascii="Consolas" w:hAnsi="Consolas"/>
-          <w:sz w:val="15"/>
-        </w:rPr>
         <w:br/>
         <w:t xml:space="preserve">    def propose(</w:t>
-      </w:r>
-      <w:r>
-        <w:rPr>
-          <w:rFonts w:ascii="Consolas" w:hAnsi="Consolas"/>
-          <w:sz w:val="15"/>
-        </w:rPr>
         <w:br/>
         <w:t xml:space="preserve">        self,</w:t>
-      </w:r>
-      <w:r>
-        <w:rPr>
-          <w:rFonts w:ascii="Consolas" w:hAnsi="Consolas"/>
-          <w:sz w:val="15"/>
-        </w:rPr>
         <w:br/>
         <w:t xml:space="preserve">        contract: OptimizationContract,</w:t>
-      </w:r>
-      <w:r>
-        <w:rPr>
-          <w:rFonts w:ascii="Consolas" w:hAnsi="Consolas"/>
-          <w:sz w:val="15"/>
-        </w:rPr>
         <w:br/>
         <w:t xml:space="preserve">        history: Sequence[TrialRecord],</w:t>
-      </w:r>
-      <w:r>
-        <w:rPr>
-          <w:rFonts w:ascii="Consolas" w:hAnsi="Consolas"/>
-          <w:sz w:val="15"/>
-        </w:rPr>
         <w:br/>
         <w:t xml:space="preserve">    ) -&gt; ProposalResult: ...</w:t>
-      </w:r>
-      <w:r>
-        <w:rPr>
-          <w:rFonts w:ascii="Consolas" w:hAnsi="Consolas"/>
-          <w:sz w:val="15"/>
-        </w:rPr>
-        <w:br/>
-      </w:r>
-      <w:r>
-        <w:rPr>
-          <w:rFonts w:ascii="Consolas" w:hAnsi="Consolas"/>
-          <w:sz w:val="15"/>
-        </w:rPr>
+        <w:br/>
         <w:br/>
         <w:t>AlgorithmFactory = Callable[[AlgorithmSpec], SearchAlgorithm]</w:t>
-      </w:r>
-      <w:r>
-        <w:rPr>
-          <w:rFonts w:ascii="Consolas" w:hAnsi="Consolas"/>
-          <w:sz w:val="15"/>
-        </w:rPr>
-        <w:br/>
-      </w:r>
-      <w:r>
-        <w:rPr>
-          <w:rFonts w:ascii="Consolas" w:hAnsi="Consolas"/>
-          <w:sz w:val="15"/>
-        </w:rPr>
+        <w:br/>
         <w:br/>
         <w:t>ALGORITHM_REGISTRY: Mapping[str, AlgorithmFactory] = {</w:t>
-      </w:r>
-      <w:r>
-        <w:rPr>
-          <w:rFonts w:ascii="Consolas" w:hAnsi="Consolas"/>
-          <w:sz w:val="15"/>
-        </w:rPr>
-        <w:br/>
-      </w:r>
-      <w:r>
-        <w:rPr>
-          <w:rFonts w:ascii="Consolas" w:hAnsi="Consolas"/>
-          <w:sz w:val="15"/>
-        </w:rPr>
+        <w:br/>
         <w:t xml:space="preserve">    "random_search": build_random_search,</w:t>
-      </w:r>
-      <w:r>
-        <w:rPr>
-          <w:rFonts w:ascii="Consolas" w:hAnsi="Consolas"/>
-          <w:sz w:val="15"/>
-        </w:rPr>
         <w:br/>
         <w:t>}</w:t>
       </w:r>
@@ -9710,19 +8022,7 @@
         <w:rPr>
           <w:sz w:val="22"/>
         </w:rPr>
-        <w:t xml:space="preserve">The Registry is a built-in mapping, not dynamic plugin discovery. Unknown names and </w:t>
-      </w:r>
-      <w:r>
-        <w:rPr>
-          <w:sz w:val="22"/>
-        </w:rPr>
-        <w:t>unsupported seed values fail during initialization</w:t>
-      </w:r>
-      <w:r>
-        <w:rPr>
-          <w:sz w:val="22"/>
-        </w:rPr>
-        <w:t>. Adding a later registered algorithm must not require changes to Runner, TrialRecord, TrialHistory, Pareto evaluation, or controller states.</w:t>
+        <w:t xml:space="preserve">The Registry is a built-in mapping, not dynamic plugin discovery. Unknown names and unsupported seed values fail during initialization. Adding a later registered algorithm must not require changes to Runner, TrialRecord, TrialHistory, Pareto evaluation, or controller states.</w:t>
       </w:r>
     </w:p>
     <w:p>
@@ -9925,13 +8225,7 @@
         <w:spacing w:after="60"/>
       </w:pPr>
       <w:r>
-        <w:t xml:space="preserve">Create one NumPy Generator from </w:t>
-      </w:r>
-      <w:r>
-        <w:t>AlgorithmSpec.seed</w:t>
-      </w:r>
-      <w:r>
-        <w:t xml:space="preserve"> during initialization.</w:t>
+        <w:t xml:space="preserve">Create one NumPy Generator from AlgorithmSpec.seed during initialization.</w:t>
       </w:r>
     </w:p>
     <w:p>
@@ -10030,66 +8324,18 @@
           <w:sz w:val="15"/>
         </w:rPr>
         <w:t>def candidate_key(</w:t>
-      </w:r>
-      <w:r>
-        <w:rPr>
-          <w:rFonts w:ascii="Consolas" w:hAnsi="Consolas"/>
-          <w:sz w:val="15"/>
-        </w:rPr>
         <w:br/>
         <w:t xml:space="preserve">    contract: OptimizationContract,</w:t>
-      </w:r>
-      <w:r>
-        <w:rPr>
-          <w:rFonts w:ascii="Consolas" w:hAnsi="Consolas"/>
-          <w:sz w:val="15"/>
-        </w:rPr>
-        <w:br/>
-      </w:r>
-      <w:r>
-        <w:rPr>
-          <w:rFonts w:ascii="Consolas" w:hAnsi="Consolas"/>
-          <w:sz w:val="15"/>
-        </w:rPr>
+        <w:br/>
         <w:t xml:space="preserve">    candidate: CandidateConfiguration,</w:t>
-      </w:r>
-      <w:r>
-        <w:rPr>
-          <w:rFonts w:ascii="Consolas" w:hAnsi="Consolas"/>
-          <w:sz w:val="15"/>
-        </w:rPr>
         <w:br/>
         <w:t>) -&gt; tuple[tuple[str, ParameterValue], ...]:</w:t>
-      </w:r>
-      <w:r>
-        <w:rPr>
-          <w:rFonts w:ascii="Consolas" w:hAnsi="Consolas"/>
-          <w:sz w:val="15"/>
-        </w:rPr>
         <w:br/>
         <w:t xml:space="preserve">    return tuple(</w:t>
-      </w:r>
-      <w:r>
-        <w:rPr>
-          <w:rFonts w:ascii="Consolas" w:hAnsi="Consolas"/>
-          <w:sz w:val="15"/>
-        </w:rPr>
         <w:br/>
         <w:t xml:space="preserve">        (definition.name, candidate.parameters[definition.name])</w:t>
-      </w:r>
-      <w:r>
-        <w:rPr>
-          <w:rFonts w:ascii="Consolas" w:hAnsi="Consolas"/>
-          <w:sz w:val="15"/>
-        </w:rPr>
         <w:br/>
         <w:t xml:space="preserve">        for definition in contract.parameters</w:t>
-      </w:r>
-      <w:r>
-        <w:rPr>
-          <w:rFonts w:ascii="Consolas" w:hAnsi="Consolas"/>
-          <w:sz w:val="15"/>
-        </w:rPr>
         <w:br/>
         <w:t xml:space="preserve">    )</w:t>
       </w:r>
@@ -10134,26 +8380,8 @@
           <w:sz w:val="15"/>
         </w:rPr>
         <w:t>domain_size(integer)     = maximum - minimum + 1</w:t>
-      </w:r>
-      <w:r>
-        <w:rPr>
-          <w:rFonts w:ascii="Consolas" w:hAnsi="Consolas"/>
-          <w:sz w:val="15"/>
-        </w:rPr>
-        <w:br/>
-      </w:r>
-      <w:r>
-        <w:rPr>
-          <w:rFonts w:ascii="Consolas" w:hAnsi="Consolas"/>
-          <w:sz w:val="15"/>
-        </w:rPr>
+        <w:br/>
         <w:t>domain_size(categorical) = len(choices)</w:t>
-      </w:r>
-      <w:r>
-        <w:rPr>
-          <w:rFonts w:ascii="Consolas" w:hAnsi="Consolas"/>
-          <w:sz w:val="15"/>
-        </w:rPr>
         <w:br/>
         <w:t>finite_space_size        = product(domain_size(parameter))</w:t>
       </w:r>
@@ -10183,13 +8411,6 @@
           <w:sz w:val="17"/>
         </w:rPr>
         <w:t>REPRODUCIBILITY BOUNDARY</w:t>
-      </w:r>
-      <w:r>
-        <w:rPr>
-          <w:b/>
-          <w:color w:val="287A4A"/>
-          <w:sz w:val="17"/>
-        </w:rPr>
         <w:br/>
       </w:r>
       <w:r>
@@ -10231,106 +8452,28 @@
           <w:sz w:val="15"/>
         </w:rPr>
         <w:t>def is_eligible(</w:t>
-      </w:r>
-      <w:r>
-        <w:rPr>
-          <w:rFonts w:ascii="Consolas" w:hAnsi="Consolas"/>
-          <w:sz w:val="15"/>
-        </w:rPr>
-        <w:br/>
-      </w:r>
-      <w:r>
-        <w:rPr>
-          <w:rFonts w:ascii="Consolas" w:hAnsi="Consolas"/>
-          <w:sz w:val="15"/>
-        </w:rPr>
+        <w:br/>
         <w:t xml:space="preserve">    record: TrialRecord,</w:t>
-      </w:r>
-      <w:r>
-        <w:rPr>
-          <w:rFonts w:ascii="Consolas" w:hAnsi="Consolas"/>
-          <w:sz w:val="15"/>
-        </w:rPr>
         <w:br/>
         <w:t xml:space="preserve">    contract: OptimizationContract,</w:t>
-      </w:r>
-      <w:r>
-        <w:rPr>
-          <w:rFonts w:ascii="Consolas" w:hAnsi="Consolas"/>
-          <w:sz w:val="15"/>
-        </w:rPr>
         <w:br/>
         <w:t>) -&gt; bool:</w:t>
-      </w:r>
-      <w:r>
-        <w:rPr>
-          <w:rFonts w:ascii="Consolas" w:hAnsi="Consolas"/>
-          <w:sz w:val="15"/>
-        </w:rPr>
         <w:br/>
         <w:t xml:space="preserve">    if not record.execution_succeeded:</w:t>
-      </w:r>
-      <w:r>
-        <w:rPr>
-          <w:rFonts w:ascii="Consolas" w:hAnsi="Consolas"/>
-          <w:sz w:val="15"/>
-        </w:rPr>
         <w:br/>
         <w:t xml:space="preserve">        return False</w:t>
-      </w:r>
-      <w:r>
-        <w:rPr>
-          <w:rFonts w:ascii="Consolas" w:hAnsi="Consolas"/>
-          <w:sz w:val="15"/>
-        </w:rPr>
         <w:br/>
         <w:t xml:space="preserve">    if record.metrics_status != "valid":</w:t>
-      </w:r>
-      <w:r>
-        <w:rPr>
-          <w:rFonts w:ascii="Consolas" w:hAnsi="Consolas"/>
-          <w:sz w:val="15"/>
-        </w:rPr>
         <w:br/>
         <w:t xml:space="preserve">        return False</w:t>
-      </w:r>
-      <w:r>
-        <w:rPr>
-          <w:rFonts w:ascii="Consolas" w:hAnsi="Consolas"/>
-          <w:sz w:val="15"/>
-        </w:rPr>
         <w:br/>
         <w:t xml:space="preserve">    return all(</w:t>
-      </w:r>
-      <w:r>
-        <w:rPr>
-          <w:rFonts w:ascii="Consolas" w:hAnsi="Consolas"/>
-          <w:sz w:val="15"/>
-        </w:rPr>
         <w:br/>
         <w:t xml:space="preserve">        objective.metric_name in record.metrics</w:t>
-      </w:r>
-      <w:r>
-        <w:rPr>
-          <w:rFonts w:ascii="Consolas" w:hAnsi="Consolas"/>
-          <w:sz w:val="15"/>
-        </w:rPr>
         <w:br/>
         <w:t xml:space="preserve">        and math.isfinite(record.metrics[objective.metric_name])</w:t>
-      </w:r>
-      <w:r>
-        <w:rPr>
-          <w:rFonts w:ascii="Consolas" w:hAnsi="Consolas"/>
-          <w:sz w:val="15"/>
-        </w:rPr>
         <w:br/>
         <w:t xml:space="preserve">        for objective in contract.objectives</w:t>
-      </w:r>
-      <w:r>
-        <w:rPr>
-          <w:rFonts w:ascii="Consolas" w:hAnsi="Consolas"/>
-          <w:sz w:val="15"/>
-        </w:rPr>
         <w:br/>
         <w:t xml:space="preserve">    )</w:t>
       </w:r>
@@ -10583,36 +8726,12 @@
           <w:sz w:val="15"/>
         </w:rPr>
         <w:t>dominates(A, B) =</w:t>
-      </w:r>
-      <w:r>
-        <w:rPr>
-          <w:rFonts w:ascii="Consolas" w:hAnsi="Consolas"/>
-          <w:sz w:val="15"/>
-        </w:rPr>
         <w:br/>
         <w:t xml:space="preserve">    all(no_worse(A[j], B[j], direction[j]) for j in objectives)</w:t>
-      </w:r>
-      <w:r>
-        <w:rPr>
-          <w:rFonts w:ascii="Consolas" w:hAnsi="Consolas"/>
-          <w:sz w:val="15"/>
-        </w:rPr>
         <w:br/>
         <w:t xml:space="preserve">    and</w:t>
-      </w:r>
-      <w:r>
-        <w:rPr>
-          <w:rFonts w:ascii="Consolas" w:hAnsi="Consolas"/>
-          <w:sz w:val="15"/>
-        </w:rPr>
         <w:br/>
         <w:t xml:space="preserve">    any(strictly_better(A[j], B[j], direction[j])</w:t>
-      </w:r>
-      <w:r>
-        <w:rPr>
-          <w:rFonts w:ascii="Consolas" w:hAnsi="Consolas"/>
-          <w:sz w:val="15"/>
-        </w:rPr>
         <w:br/>
         <w:t xml:space="preserve">        for j in objectives)</w:t>
       </w:r>
@@ -10677,98 +8796,26 @@
           <w:sz w:val="15"/>
         </w:rPr>
         <w:t>eligible = [r for r in history if is_eligible(r, contract)]</w:t>
-      </w:r>
-      <w:r>
-        <w:rPr>
-          <w:rFonts w:ascii="Consolas" w:hAnsi="Consolas"/>
-          <w:sz w:val="15"/>
-        </w:rPr>
-        <w:br/>
-      </w:r>
-      <w:r>
-        <w:rPr>
-          <w:rFonts w:ascii="Consolas" w:hAnsi="Consolas"/>
-          <w:sz w:val="15"/>
-        </w:rPr>
+        <w:br/>
         <w:br/>
         <w:t>front = []</w:t>
-      </w:r>
-      <w:r>
-        <w:rPr>
-          <w:rFonts w:ascii="Consolas" w:hAnsi="Consolas"/>
-          <w:sz w:val="15"/>
-        </w:rPr>
         <w:br/>
         <w:t>for candidate in eligible:</w:t>
-      </w:r>
-      <w:r>
-        <w:rPr>
-          <w:rFonts w:ascii="Consolas" w:hAnsi="Consolas"/>
-          <w:sz w:val="15"/>
-        </w:rPr>
         <w:br/>
         <w:t xml:space="preserve">    if not any(</w:t>
-      </w:r>
-      <w:r>
-        <w:rPr>
-          <w:rFonts w:ascii="Consolas" w:hAnsi="Consolas"/>
-          <w:sz w:val="15"/>
-        </w:rPr>
         <w:br/>
         <w:t xml:space="preserve">        other.trial_id != candidate.trial_id</w:t>
-      </w:r>
-      <w:r>
-        <w:rPr>
-          <w:rFonts w:ascii="Consolas" w:hAnsi="Consolas"/>
-          <w:sz w:val="15"/>
-        </w:rPr>
         <w:br/>
         <w:t xml:space="preserve">        and dominates(other, candidate, contract)</w:t>
-      </w:r>
-      <w:r>
-        <w:rPr>
-          <w:rFonts w:ascii="Consolas" w:hAnsi="Consolas"/>
-          <w:sz w:val="15"/>
-        </w:rPr>
         <w:br/>
         <w:t xml:space="preserve">        for other in eligible</w:t>
-      </w:r>
-      <w:r>
-        <w:rPr>
-          <w:rFonts w:ascii="Consolas" w:hAnsi="Consolas"/>
-          <w:sz w:val="15"/>
-        </w:rPr>
         <w:br/>
         <w:t xml:space="preserve">    ):</w:t>
-      </w:r>
-      <w:r>
-        <w:rPr>
-          <w:rFonts w:ascii="Consolas" w:hAnsi="Consolas"/>
-          <w:sz w:val="15"/>
-        </w:rPr>
         <w:br/>
         <w:t xml:space="preserve">        front.append(candidate)</w:t>
-      </w:r>
-      <w:r>
-        <w:rPr>
-          <w:rFonts w:ascii="Consolas" w:hAnsi="Consolas"/>
-          <w:sz w:val="15"/>
-        </w:rPr>
-        <w:br/>
-      </w:r>
-      <w:r>
-        <w:rPr>
-          <w:rFonts w:ascii="Consolas" w:hAnsi="Consolas"/>
-          <w:sz w:val="15"/>
-        </w:rPr>
+        <w:br/>
         <w:br/>
         <w:t>front.sort(key=lambda record: record.trial_id)</w:t>
-      </w:r>
-      <w:r>
-        <w:rPr>
-          <w:rFonts w:ascii="Consolas" w:hAnsi="Consolas"/>
-          <w:sz w:val="15"/>
-        </w:rPr>
         <w:br/>
         <w:t>return ParetoFront(records=tuple(front))</w:t>
       </w:r>
@@ -10916,15 +8963,7 @@
                 <w:color w:val="1F4D78"/>
                 <w:sz w:val="17"/>
               </w:rPr>
-              <w:t>Validation accuracy</w:t>
-            </w:r>
-            <w:r>
-              <w:rPr>
-                <w:b/>
-                <w:color w:val="1F4D78"/>
-                <w:sz w:val="17"/>
-              </w:rPr>
-              <w:t xml:space="preserve"> ↑</w:t>
+              <w:t xml:space="preserve">Validation accuracy ↑</w:t>
             </w:r>
           </w:p>
         </w:tc>
@@ -10950,15 +8989,7 @@
                 <w:color w:val="1F4D78"/>
                 <w:sz w:val="17"/>
               </w:rPr>
-              <w:t>Validation loss</w:t>
-            </w:r>
-            <w:r>
-              <w:rPr>
-                <w:b/>
-                <w:color w:val="1F4D78"/>
-                <w:sz w:val="17"/>
-              </w:rPr>
-              <w:t xml:space="preserve"> ↓</w:t>
+              <w:t xml:space="preserve">Validation loss ↓</w:t>
             </w:r>
           </w:p>
         </w:tc>
@@ -11445,19 +9476,7 @@
               <w:rPr>
                 <w:sz w:val="17"/>
               </w:rPr>
-              <w:t xml:space="preserve">Front: </w:t>
-            </w:r>
-            <w:r>
-              <w:rPr>
-                <w:sz w:val="17"/>
-              </w:rPr>
-              <w:t>validation_accuracy</w:t>
-            </w:r>
-            <w:r>
-              <w:rPr>
-                <w:sz w:val="17"/>
-              </w:rPr>
-              <w:t xml:space="preserve"> trade-off</w:t>
+              <w:t xml:space="preserve">Front: validation_accuracy trade-off</w:t>
             </w:r>
           </w:p>
         </w:tc>
@@ -11572,13 +9591,6 @@
           <w:sz w:val="17"/>
         </w:rPr>
         <w:t>AUTHORITATIVE FIXTURE</w:t>
-      </w:r>
-      <w:r>
-        <w:rPr>
-          <w:b/>
-          <w:color w:val="6F42A5"/>
-          <w:sz w:val="17"/>
-        </w:rPr>
         <w:br/>
       </w:r>
       <w:r>
@@ -11612,96 +9624,24 @@
           <w:sz w:val="15"/>
         </w:rPr>
         <w:t>ResultStatus = Literal["pareto_front_available", "no_eligible_trials"]</w:t>
-      </w:r>
-      <w:r>
-        <w:rPr>
-          <w:rFonts w:ascii="Consolas" w:hAnsi="Consolas"/>
-          <w:sz w:val="15"/>
-        </w:rPr>
-        <w:br/>
-      </w:r>
-      <w:r>
-        <w:rPr>
-          <w:rFonts w:ascii="Consolas" w:hAnsi="Consolas"/>
-          <w:sz w:val="15"/>
-        </w:rPr>
+        <w:br/>
         <w:br/>
         <w:t>@dataclass(frozen=True)</w:t>
-      </w:r>
-      <w:r>
-        <w:rPr>
-          <w:rFonts w:ascii="Consolas" w:hAnsi="Consolas"/>
-          <w:sz w:val="15"/>
-        </w:rPr>
         <w:br/>
         <w:t>class ParetoFront:</w:t>
-      </w:r>
-      <w:r>
-        <w:rPr>
-          <w:rFonts w:ascii="Consolas" w:hAnsi="Consolas"/>
-          <w:sz w:val="15"/>
-        </w:rPr>
         <w:br/>
         <w:t xml:space="preserve">    records: tuple[TrialRecord, ...]</w:t>
-      </w:r>
-      <w:r>
-        <w:rPr>
-          <w:rFonts w:ascii="Consolas" w:hAnsi="Consolas"/>
-          <w:sz w:val="15"/>
-        </w:rPr>
-        <w:br/>
-      </w:r>
-      <w:r>
-        <w:rPr>
-          <w:rFonts w:ascii="Consolas" w:hAnsi="Consolas"/>
-          <w:sz w:val="15"/>
-        </w:rPr>
-        <w:br/>
-      </w:r>
-      <w:r>
-        <w:rPr>
-          <w:rFonts w:ascii="Consolas" w:hAnsi="Consolas"/>
-          <w:sz w:val="15"/>
-        </w:rPr>
+        <w:br/>
+        <w:br/>
         <w:t>@dataclass(frozen=True)</w:t>
-      </w:r>
-      <w:r>
-        <w:rPr>
-          <w:rFonts w:ascii="Consolas" w:hAnsi="Consolas"/>
-          <w:sz w:val="15"/>
-        </w:rPr>
         <w:br/>
         <w:t>class OptimizationResult:</w:t>
-      </w:r>
-      <w:r>
-        <w:rPr>
-          <w:rFonts w:ascii="Consolas" w:hAnsi="Consolas"/>
-          <w:sz w:val="15"/>
-        </w:rPr>
         <w:br/>
         <w:t xml:space="preserve">    pareto_front: ParetoFront</w:t>
-      </w:r>
-      <w:r>
-        <w:rPr>
-          <w:rFonts w:ascii="Consolas" w:hAnsi="Consolas"/>
-          <w:sz w:val="15"/>
-        </w:rPr>
         <w:br/>
         <w:t xml:space="preserve">    termination_reason: TerminationReason</w:t>
-      </w:r>
-      <w:r>
-        <w:rPr>
-          <w:rFonts w:ascii="Consolas" w:hAnsi="Consolas"/>
-          <w:sz w:val="15"/>
-        </w:rPr>
         <w:br/>
         <w:t xml:space="preserve">    result_status: ResultStatus</w:t>
-      </w:r>
-      <w:r>
-        <w:rPr>
-          <w:rFonts w:ascii="Consolas" w:hAnsi="Consolas"/>
-          <w:sz w:val="15"/>
-        </w:rPr>
         <w:br/>
         <w:t xml:space="preserve">    history: tuple[TrialRecord, ...]</w:t>
       </w:r>
@@ -11739,122 +9679,32 @@
           <w:sz w:val="15"/>
         </w:rPr>
         <w:t>runs/run_2026-07-17_140500_ab12cd/</w:t>
-      </w:r>
-      <w:r>
-        <w:rPr>
-          <w:rFonts w:ascii="Consolas" w:hAnsi="Consolas"/>
-          <w:sz w:val="15"/>
-        </w:rPr>
         <w:br/>
         <w:t>├── resolved_config.json</w:t>
-      </w:r>
-      <w:r>
-        <w:rPr>
-          <w:rFonts w:ascii="Consolas" w:hAnsi="Consolas"/>
-          <w:sz w:val="15"/>
-        </w:rPr>
         <w:br/>
         <w:t>├── history.csv</w:t>
-      </w:r>
-      <w:r>
-        <w:rPr>
-          <w:rFonts w:ascii="Consolas" w:hAnsi="Consolas"/>
-          <w:sz w:val="15"/>
-        </w:rPr>
         <w:br/>
         <w:t>├── pareto_front.csv</w:t>
-      </w:r>
-      <w:r>
-        <w:rPr>
-          <w:rFonts w:ascii="Consolas" w:hAnsi="Consolas"/>
-          <w:sz w:val="15"/>
-        </w:rPr>
         <w:br/>
         <w:t>├── summary.txt</w:t>
-      </w:r>
-      <w:r>
-        <w:rPr>
-          <w:rFonts w:ascii="Consolas" w:hAnsi="Consolas"/>
-          <w:sz w:val="15"/>
-        </w:rPr>
         <w:br/>
         <w:t>├── plots/</w:t>
-      </w:r>
-      <w:r>
-        <w:rPr>
-          <w:rFonts w:ascii="Consolas" w:hAnsi="Consolas"/>
-          <w:sz w:val="15"/>
-        </w:rPr>
         <w:br/>
         <w:t>│   └── pareto_projection.png</w:t>
-      </w:r>
-      <w:r>
-        <w:rPr>
-          <w:rFonts w:ascii="Consolas" w:hAnsi="Consolas"/>
-          <w:sz w:val="15"/>
-        </w:rPr>
         <w:br/>
         <w:t>└── trials/</w:t>
-      </w:r>
-      <w:r>
-        <w:rPr>
-          <w:rFonts w:ascii="Consolas" w:hAnsi="Consolas"/>
-          <w:sz w:val="15"/>
-        </w:rPr>
         <w:br/>
         <w:t xml:space="preserve">    ├── trial_0001/</w:t>
-      </w:r>
-      <w:r>
-        <w:rPr>
-          <w:rFonts w:ascii="Consolas" w:hAnsi="Consolas"/>
-          <w:sz w:val="15"/>
-        </w:rPr>
         <w:br/>
         <w:t xml:space="preserve">    │   ├── metrics.csv</w:t>
-      </w:r>
-      <w:r>
-        <w:rPr>
-          <w:rFonts w:ascii="Consolas" w:hAnsi="Consolas"/>
-          <w:sz w:val="15"/>
-        </w:rPr>
         <w:br/>
         <w:t xml:space="preserve">    │   ├── stdout.txt</w:t>
-      </w:r>
-      <w:r>
-        <w:rPr>
-          <w:rFonts w:ascii="Consolas" w:hAnsi="Consolas"/>
-          <w:sz w:val="15"/>
-        </w:rPr>
-        <w:br/>
-      </w:r>
-      <w:r>
-        <w:rPr>
-          <w:rFonts w:ascii="Consolas" w:hAnsi="Consolas"/>
-          <w:sz w:val="15"/>
-        </w:rPr>
+        <w:br/>
         <w:t xml:space="preserve">    │   └── stderr.txt</w:t>
-      </w:r>
-      <w:r>
-        <w:rPr>
-          <w:rFonts w:ascii="Consolas" w:hAnsi="Consolas"/>
-          <w:sz w:val="15"/>
-        </w:rPr>
         <w:br/>
         <w:t xml:space="preserve">    ├── trial_0002/</w:t>
-      </w:r>
-      <w:r>
-        <w:rPr>
-          <w:rFonts w:ascii="Consolas" w:hAnsi="Consolas"/>
-          <w:sz w:val="15"/>
-        </w:rPr>
         <w:br/>
         <w:t xml:space="preserve">    │   └── ...</w:t>
-      </w:r>
-      <w:r>
-        <w:rPr>
-          <w:rFonts w:ascii="Consolas" w:hAnsi="Consolas"/>
-          <w:sz w:val="15"/>
-        </w:rPr>
         <w:br/>
         <w:t xml:space="preserve">    └── ...</w:t>
       </w:r>
@@ -11943,85 +9793,12 @@
           <w:sz w:val="15"/>
         </w:rPr>
         <w:t>trial_id,execution_status,metrics_status,execution_succeeded,</w:t>
-      </w:r>
-      <w:r>
-        <w:rPr>
-          <w:rFonts w:ascii="Consolas" w:hAnsi="Consolas"/>
-          <w:sz w:val="15"/>
-        </w:rPr>
         <w:br/>
         <w:t>objective_eligible,runtime_seconds,exit_code,timed_out,</w:t>
-      </w:r>
-      <w:r>
-        <w:rPr>
-          <w:rFonts w:ascii="Consolas" w:hAnsi="Consolas"/>
-          <w:sz w:val="15"/>
-        </w:rPr>
-        <w:br/>
-      </w:r>
-      <w:r>
-        <w:rPr>
-          <w:rFonts w:ascii="Consolas" w:hAnsi="Consolas"/>
-          <w:sz w:val="15"/>
-        </w:rPr>
-        <w:t>param.learning_rate,param.hidden_size,param.epochs,param.batch_size</w:t>
-      </w:r>
-      <w:r>
-        <w:rPr>
-          <w:rFonts w:ascii="Consolas" w:hAnsi="Consolas"/>
-          <w:sz w:val="15"/>
-        </w:rPr>
-        <w:t>,</w:t>
-      </w:r>
-      <w:r>
-        <w:rPr>
-          <w:rFonts w:ascii="Consolas" w:hAnsi="Consolas"/>
-          <w:sz w:val="15"/>
-        </w:rPr>
-        <w:br/>
-        <w:t>metric.</w:t>
-      </w:r>
-      <w:r>
-        <w:rPr>
-          <w:rFonts w:ascii="Consolas" w:hAnsi="Consolas"/>
-          <w:sz w:val="15"/>
-        </w:rPr>
-        <w:t>validation_accuracy</w:t>
-      </w:r>
-      <w:r>
-        <w:rPr>
-          <w:rFonts w:ascii="Consolas" w:hAnsi="Consolas"/>
-          <w:sz w:val="15"/>
-        </w:rPr>
-        <w:t>,metric.</w:t>
-      </w:r>
-      <w:r>
-        <w:rPr>
-          <w:rFonts w:ascii="Consolas" w:hAnsi="Consolas"/>
-          <w:sz w:val="15"/>
-        </w:rPr>
-        <w:t>validation_loss</w:t>
-      </w:r>
-      <w:r>
-        <w:rPr>
-          <w:rFonts w:ascii="Consolas" w:hAnsi="Consolas"/>
-          <w:sz w:val="15"/>
-        </w:rPr>
-        <w:t>,metric.</w:t>
-      </w:r>
-      <w:r>
-        <w:rPr>
-          <w:rFonts w:ascii="Consolas" w:hAnsi="Consolas"/>
-          <w:sz w:val="15"/>
-        </w:rPr>
-        <w:t>training_time_seconds</w:t>
-      </w:r>
-      <w:r>
-        <w:rPr>
-          <w:rFonts w:ascii="Consolas" w:hAnsi="Consolas"/>
-          <w:sz w:val="15"/>
-        </w:rPr>
-        <w:t>,error_message</w:t>
+        <w:br/>
+        <w:t>param.learning_rate,param.hidden_size,param.epochs,param.batch_size,</w:t>
+        <w:br/>
+        <w:t>metric.validation_accuracy,metric.validation_loss,metric.training_time_seconds,error_message</w:t>
       </w:r>
     </w:p>
     <w:tbl>
@@ -13094,13 +10871,7 @@
               <w:rPr>
                 <w:sz w:val="17"/>
               </w:rPr>
-              <w:t xml:space="preserve">Name is registered; </w:t>
-            </w:r>
-            <w:r>
-              <w:rPr>
-                <w:sz w:val="17"/>
-              </w:rPr>
-              <w:t>RandomSearch has one direct integer seed unless later approved.</w:t>
+              <w:t xml:space="preserve">Name is registered; RandomSearch has one direct integer seed unless later approved.</w:t>
             </w:r>
           </w:p>
         </w:tc>
@@ -13236,13 +11007,6 @@
           <w:sz w:val="17"/>
         </w:rPr>
         <w:t>FAIL-FAST RULE</w:t>
-      </w:r>
-      <w:r>
-        <w:rPr>
-          <w:b/>
-          <w:color w:val="9B1C1C"/>
-          <w:sz w:val="17"/>
-        </w:rPr>
         <w:br/>
       </w:r>
       <w:r>
@@ -14179,188 +11943,50 @@
           <w:sz w:val="15"/>
         </w:rPr>
         <w:t>black_box_optimizer/</w:t>
-      </w:r>
-      <w:r>
-        <w:rPr>
-          <w:rFonts w:ascii="Consolas" w:hAnsi="Consolas"/>
-          <w:sz w:val="15"/>
-        </w:rPr>
         <w:br/>
         <w:t>|-- __init__.py               # public exports</w:t>
-      </w:r>
-      <w:r>
-        <w:rPr>
-          <w:rFonts w:ascii="Consolas" w:hAnsi="Consolas"/>
-          <w:sz w:val="15"/>
-        </w:rPr>
         <w:br/>
         <w:t>|-- __main__.py               # planned module entry point</w:t>
-      </w:r>
-      <w:r>
-        <w:rPr>
-          <w:rFonts w:ascii="Consolas" w:hAnsi="Consolas"/>
-          <w:sz w:val="15"/>
-        </w:rPr>
         <w:br/>
         <w:t>|-- cli.py                    # planned CLI composition</w:t>
-      </w:r>
-      <w:r>
-        <w:rPr>
-          <w:rFonts w:ascii="Consolas" w:hAnsi="Consolas"/>
-          <w:sz w:val="15"/>
-        </w:rPr>
         <w:br/>
         <w:t>|-- models.py                 # immutable foundation and later records</w:t>
-      </w:r>
-      <w:r>
-        <w:rPr>
-          <w:rFonts w:ascii="Consolas" w:hAnsi="Consolas"/>
-          <w:sz w:val="15"/>
-        </w:rPr>
         <w:br/>
         <w:t>|-- config_loader.py          # JSON parsing and validation</w:t>
-      </w:r>
-      <w:r>
-        <w:rPr>
-          <w:rFonts w:ascii="Consolas" w:hAnsi="Consolas"/>
-          <w:sz w:val="15"/>
-        </w:rPr>
         <w:br/>
         <w:t>|-- controller.py             # sequential lifecycle governor</w:t>
-      </w:r>
-      <w:r>
-        <w:rPr>
-          <w:rFonts w:ascii="Consolas" w:hAnsi="Consolas"/>
-          <w:sz w:val="15"/>
-        </w:rPr>
         <w:br/>
         <w:t>|-- stop_policy.py            # StopDecision evaluation</w:t>
-      </w:r>
-      <w:r>
-        <w:rPr>
-          <w:rFonts w:ascii="Consolas" w:hAnsi="Consolas"/>
-          <w:sz w:val="15"/>
-        </w:rPr>
         <w:br/>
         <w:t>|-- runner.py                 # synchronous subprocess boundary</w:t>
-      </w:r>
-      <w:r>
-        <w:rPr>
-          <w:rFonts w:ascii="Consolas" w:hAnsi="Consolas"/>
-          <w:sz w:val="15"/>
-        </w:rPr>
         <w:br/>
         <w:t>|-- metrics.py                # one-row CSV parsing</w:t>
-      </w:r>
-      <w:r>
-        <w:rPr>
-          <w:rFonts w:ascii="Consolas" w:hAnsi="Consolas"/>
-          <w:sz w:val="15"/>
-        </w:rPr>
         <w:br/>
         <w:t>|-- records.py                # TrialRecord construction</w:t>
-      </w:r>
-      <w:r>
-        <w:rPr>
-          <w:rFonts w:ascii="Consolas" w:hAnsi="Consolas"/>
-          <w:sz w:val="15"/>
-        </w:rPr>
         <w:br/>
         <w:t>|-- history.py                # append-only history and snapshots</w:t>
-      </w:r>
-      <w:r>
-        <w:rPr>
-          <w:rFonts w:ascii="Consolas" w:hAnsi="Consolas"/>
-          <w:sz w:val="15"/>
-        </w:rPr>
         <w:br/>
         <w:t>|-- persistence.py            # atomic checkpoints and run paths</w:t>
-      </w:r>
-      <w:r>
-        <w:rPr>
-          <w:rFonts w:ascii="Consolas" w:hAnsi="Consolas"/>
-          <w:sz w:val="15"/>
-        </w:rPr>
         <w:br/>
         <w:t>|-- pareto.py                 # eligibility, dominance, ParetoFront</w:t>
-      </w:r>
-      <w:r>
-        <w:rPr>
-          <w:rFonts w:ascii="Consolas" w:hAnsi="Consolas"/>
-          <w:sz w:val="15"/>
-        </w:rPr>
         <w:br/>
         <w:t>|-- results.py                # OptimizationResult construction</w:t>
-      </w:r>
-      <w:r>
-        <w:rPr>
-          <w:rFonts w:ascii="Consolas" w:hAnsi="Consolas"/>
-          <w:sz w:val="15"/>
-        </w:rPr>
         <w:br/>
         <w:t>|-- reporting.py              # summary, exports, and plots</w:t>
-      </w:r>
-      <w:r>
-        <w:rPr>
-          <w:rFonts w:ascii="Consolas" w:hAnsi="Consolas"/>
-          <w:sz w:val="15"/>
-        </w:rPr>
         <w:br/>
         <w:t>`-- search/</w:t>
-      </w:r>
-      <w:r>
-        <w:rPr>
-          <w:rFonts w:ascii="Consolas" w:hAnsi="Consolas"/>
-          <w:sz w:val="15"/>
-        </w:rPr>
         <w:br/>
         <w:t xml:space="preserve">    |-- base.py               # SearchAlgorithm and ProposalResult</w:t>
-      </w:r>
-      <w:r>
-        <w:rPr>
-          <w:rFonts w:ascii="Consolas" w:hAnsi="Consolas"/>
-          <w:sz w:val="15"/>
-        </w:rPr>
         <w:br/>
         <w:t xml:space="preserve">    |-- registry.py           # built-in factory mapping</w:t>
-      </w:r>
-      <w:r>
-        <w:rPr>
-          <w:rFonts w:ascii="Consolas" w:hAnsi="Consolas"/>
-          <w:sz w:val="15"/>
-        </w:rPr>
         <w:br/>
         <w:t xml:space="preserve">    `-- random_search.py      # seeded MVP algorithm</w:t>
-      </w:r>
-      <w:r>
-        <w:rPr>
-          <w:rFonts w:ascii="Consolas" w:hAnsi="Consolas"/>
-          <w:sz w:val="15"/>
-        </w:rPr>
         <w:br/>
         <w:t>examples/iris_torch/</w:t>
-      </w:r>
-      <w:r>
-        <w:rPr>
-          <w:rFonts w:ascii="Consolas" w:hAnsi="Consolas"/>
-          <w:sz w:val="15"/>
-        </w:rPr>
         <w:br/>
         <w:t>|-- iris_config.json          # example project configuration</w:t>
-      </w:r>
-      <w:r>
-        <w:rPr>
-          <w:rFonts w:ascii="Consolas" w:hAnsi="Consolas"/>
-          <w:sz w:val="15"/>
-        </w:rPr>
         <w:br/>
         <w:t>`-- worker.py                 # external opaque PyTorch worker</w:t>
-      </w:r>
-      <w:r>
-        <w:rPr>
-          <w:rFonts w:ascii="Consolas" w:hAnsi="Consolas"/>
-          <w:sz w:val="15"/>
-        </w:rPr>
         <w:br/>
         <w:t>tests/                        # unit, contract, integration, acceptance</w:t>
       </w:r>
@@ -15319,6 +12945,59 @@
           </w:p>
         </w:tc>
       </w:tr>
+      <w:tr>
+        <w:tc>
+          <w:tcPr>
+            <w:tcW w:w="1900" w:type="dxa"/>
+            <w:vAlign w:val="center"/>
+          </w:tcPr>
+          <w:p>
+            <w:pPr>
+              <w:spacing w:after="0" w:line="247" w:lineRule="auto"/>
+            </w:pPr>
+            <w:r>
+              <w:rPr>
+                <w:sz w:val="16"/>
+              </w:rPr>
+              <w:t>persistence</w:t>
+            </w:r>
+          </w:p>
+        </w:tc>
+        <w:tc>
+          <w:tcPr>
+            <w:tcW w:w="3520" w:type="dxa"/>
+            <w:vAlign w:val="center"/>
+          </w:tcPr>
+          <w:p>
+            <w:pPr>
+              <w:spacing w:after="0" w:line="247" w:lineRule="auto"/>
+            </w:pPr>
+            <w:r>
+              <w:rPr>
+                <w:sz w:val="16"/>
+              </w:rPr>
+              <w:t>OptimizationContract, TrialRecord, Pareto's is_eligible()</w:t>
+            </w:r>
+          </w:p>
+        </w:tc>
+        <w:tc>
+          <w:tcPr>
+            <w:tcW w:w="3940" w:type="dxa"/>
+            <w:vAlign w:val="center"/>
+          </w:tcPr>
+          <w:p>
+            <w:pPr>
+              <w:spacing w:after="0" w:line="247" w:lineRule="auto"/>
+            </w:pPr>
+            <w:r>
+              <w:rPr>
+                <w:sz w:val="16"/>
+              </w:rPr>
+              <w:t>Runner, WorkerSpec, AlgorithmSpec, controller</w:t>
+            </w:r>
+          </w:p>
+        </w:tc>
+      </w:tr>
     </w:tbl>
     <w:p>
       <w:pPr>
@@ -15348,51 +13027,14 @@
           <w:rFonts w:ascii="Consolas" w:hAnsi="Consolas"/>
           <w:sz w:val="15"/>
         </w:rPr>
-        <w:t xml:space="preserve">python -m black_box_optimizer </w:t>
-      </w:r>
-      <w:r>
-        <w:rPr>
-          <w:rFonts w:ascii="Consolas" w:hAnsi="Consolas"/>
-          <w:sz w:val="15"/>
-        </w:rPr>
-        <w:t>examples/iris_torch/iris_config.json</w:t>
-      </w:r>
-      <w:r>
-        <w:rPr>
-          <w:rFonts w:ascii="Consolas" w:hAnsi="Consolas"/>
-          <w:sz w:val="15"/>
-        </w:rPr>
-        <w:br/>
-      </w:r>
-      <w:r>
-        <w:rPr>
-          <w:rFonts w:ascii="Consolas" w:hAnsi="Consolas"/>
-          <w:sz w:val="15"/>
-        </w:rPr>
+        <w:t xml:space="preserve">python -m black_box_optimizer examples/iris_torch/iris_config.json</w:t>
+        <w:br/>
         <w:br/>
         <w:t>Exit 0  = run finalized and Pareto Front is available</w:t>
-      </w:r>
-      <w:r>
-        <w:rPr>
-          <w:rFonts w:ascii="Consolas" w:hAnsi="Consolas"/>
-          <w:sz w:val="15"/>
-        </w:rPr>
         <w:br/>
         <w:t>Exit 2  = run finalized but no eligible trials exist</w:t>
-      </w:r>
-      <w:r>
-        <w:rPr>
-          <w:rFonts w:ascii="Consolas" w:hAnsi="Consolas"/>
-          <w:sz w:val="15"/>
-        </w:rPr>
         <w:br/>
         <w:t>Exit 3  = user cancelled; retained evidence finalized</w:t>
-      </w:r>
-      <w:r>
-        <w:rPr>
-          <w:rFonts w:ascii="Consolas" w:hAnsi="Consolas"/>
-          <w:sz w:val="15"/>
-        </w:rPr>
         <w:br/>
         <w:t>Exit 1  = fatal initialization or runtime failure</w:t>
       </w:r>
@@ -17855,19 +15497,7 @@
               <w:rPr>
                 <w:sz w:val="17"/>
               </w:rPr>
-              <w:t xml:space="preserve">TDS remains </w:t>
-            </w:r>
-            <w:r>
-              <w:rPr>
-                <w:sz w:val="17"/>
-              </w:rPr>
-              <w:t>Draft v0.2</w:t>
-            </w:r>
-            <w:r>
-              <w:rPr>
-                <w:sz w:val="17"/>
-              </w:rPr>
-              <w:t xml:space="preserve"> until technical review is recorded.</w:t>
+              <w:t xml:space="preserve">TDS remains Draft v0.2 until technical review is recorded.</w:t>
             </w:r>
           </w:p>
         </w:tc>
@@ -18062,26 +15692,13 @@
           <w:sz w:val="17"/>
         </w:rPr>
         <w:t>APPROVAL EFFECT</w:t>
-      </w:r>
-      <w:r>
-        <w:rPr>
-          <w:b/>
-          <w:color w:val="2E74B5"/>
-          <w:sz w:val="17"/>
-        </w:rPr>
         <w:br/>
       </w:r>
       <w:r>
         <w:rPr>
           <w:sz w:val="20"/>
         </w:rPr>
-        <w:t xml:space="preserve">Technical approval establishes this specification as the implementation baseline for WP-02 through WP-08. </w:t>
-      </w:r>
-      <w:r>
-        <w:rPr>
-          <w:sz w:val="20"/>
-        </w:rPr>
-        <w:t>Approval does not ratify the Charter or Scope of Work, assign additional individual ownership, or authorize excluded capabilities.</w:t>
+        <w:t xml:space="preserve">Technical approval establishes this specification as the implementation baseline for WP-02 through WP-08. Approval does not ratify the Charter or Scope of Work, assign additional individual ownership, or authorize excluded capabilities.</w:t>
       </w:r>
     </w:p>
     <w:tbl>
@@ -18799,13 +16416,6 @@
           <w:sz w:val="17"/>
         </w:rPr>
         <w:t>FINAL TECHNICAL SUMMARY</w:t>
-      </w:r>
-      <w:r>
-        <w:rPr>
-          <w:b/>
-          <w:color w:val="287A4A"/>
-          <w:sz w:val="17"/>
-        </w:rPr>
         <w:br/>
       </w:r>
       <w:r>

</xml_diff>